<commit_message>
Thursday Night Before Day6 Exam
19 march last day ramadan
</commit_message>
<xml_diff>
--- a/Task 1/Task 1a/Task1_Proposal_LL-000020914_Naser_A.docx
+++ b/Task 1/Task 1a/Task1_Proposal_LL-000020914_Naser_A.docx
@@ -1922,14 +1922,17 @@
       </w:r>
     </w:p>
     <w:p/>
-    <w:p/>
-    <w:p/>
+    <w:p>
+      <w:pPr>
+        <w:pStyle w:val="Heading1"/>
+      </w:pPr>
+      <w:bookmarkStart w:id="3" w:name="_Toc224242721"/>
+    </w:p>
     <w:p/>
     <w:p>
       <w:pPr>
         <w:pStyle w:val="Heading1"/>
       </w:pPr>
-      <w:bookmarkStart w:id="3" w:name="_Toc224242721"/>
       <w:r>
         <w:lastRenderedPageBreak/>
         <w:t>Functional Requirements</w:t>
@@ -2586,16 +2589,8 @@
               <w:lastRenderedPageBreak/>
               <w:t xml:space="preserve">Having an account for Merinda is </w:t>
             </w:r>
-            <w:proofErr w:type="gramStart"/>
-            <w:r>
-              <w:t xml:space="preserve">necessary,  </w:t>
-            </w:r>
-            <w:r>
-              <w:t xml:space="preserve"> </w:t>
-            </w:r>
-            <w:proofErr w:type="gramEnd"/>
-            <w:r>
-              <w:t xml:space="preserve">           </w:t>
+            <w:r>
+              <w:t>necessary, she wants to place and manage her orders easily. To place an order, an account is needed so that personalised data can be stored. Without an account, Merinda will be restricted from making a purchase.</w:t>
             </w:r>
           </w:p>
         </w:tc>
@@ -2756,7 +2751,19 @@
           <w:tcPr>
             <w:tcW w:w="2784" w:type="dxa"/>
           </w:tcPr>
-          <w:p/>
+          <w:p>
+            <w:r>
+              <w:t xml:space="preserve">Jack wants to register because he wants to be able to place orders, get loyalty points, view his orders and track them. An account is very important to any </w:t>
+            </w:r>
+            <w:proofErr w:type="gramStart"/>
+            <w:r>
+              <w:t>user,</w:t>
+            </w:r>
+            <w:proofErr w:type="gramEnd"/>
+            <w:r>
+              <w:t xml:space="preserve"> it makes their user experience much improved.</w:t>
+            </w:r>
+          </w:p>
         </w:tc>
       </w:tr>
       <w:tr>
@@ -2849,7 +2856,14 @@
           <w:tcPr>
             <w:tcW w:w="2784" w:type="dxa"/>
           </w:tcPr>
-          <w:p/>
+          <w:p>
+            <w:r>
+              <w:t xml:space="preserve">Tom needs to be able to log in, so he could access his producer dashboard and manage his account. </w:t>
+            </w:r>
+            <w:r>
+              <w:t>Without logging in he will not have access to his personalised data stored in the system.</w:t>
+            </w:r>
+          </w:p>
         </w:tc>
       </w:tr>
       <w:tr>
@@ -2942,7 +2956,20 @@
           <w:tcPr>
             <w:tcW w:w="2784" w:type="dxa"/>
           </w:tcPr>
-          <w:p/>
+          <w:p>
+            <w:r>
+              <w:t xml:space="preserve">To be able to view previous orders, Merinda needs to log in to her account that she used to make purchases. Logging in </w:t>
+            </w:r>
+            <w:r>
+              <w:t xml:space="preserve">makes it possible for her to access the </w:t>
+            </w:r>
+            <w:r>
+              <w:t xml:space="preserve">saved data of previous sessions </w:t>
+            </w:r>
+            <w:r>
+              <w:t>since it is linked to her account.</w:t>
+            </w:r>
+          </w:p>
         </w:tc>
       </w:tr>
       <w:tr>
@@ -3038,7 +3065,24 @@
           <w:tcPr>
             <w:tcW w:w="2784" w:type="dxa"/>
           </w:tcPr>
-          <w:p/>
+          <w:p>
+            <w:proofErr w:type="gramStart"/>
+            <w:r>
+              <w:t>In order for</w:t>
+            </w:r>
+            <w:proofErr w:type="gramEnd"/>
+            <w:r>
+              <w:t xml:space="preserve"> Jack to view his </w:t>
+            </w:r>
+            <w:proofErr w:type="gramStart"/>
+            <w:r>
+              <w:t>saved up</w:t>
+            </w:r>
+            <w:proofErr w:type="gramEnd"/>
+            <w:r>
+              <w:t xml:space="preserve"> loyalty points, view his previous orders, place orders and track them he will need to log in to his existing account. The saved data from previous sessions are only accessible when logged in.</w:t>
+            </w:r>
+          </w:p>
         </w:tc>
       </w:tr>
       <w:tr>
@@ -3147,6 +3191,7 @@
               </w:numPr>
             </w:pPr>
             <w:r>
+              <w:lastRenderedPageBreak/>
               <w:t>Update</w:t>
             </w:r>
             <w:r>
@@ -3186,16 +3231,32 @@
               </w:numPr>
             </w:pPr>
             <w:r>
+              <w:t>Receive confirmation message</w:t>
+            </w:r>
+          </w:p>
+        </w:tc>
+        <w:tc>
+          <w:tcPr>
+            <w:tcW w:w="2784" w:type="dxa"/>
+          </w:tcPr>
+          <w:p>
+            <w:r>
               <w:lastRenderedPageBreak/>
-              <w:t>Receive confirmation message</w:t>
-            </w:r>
-          </w:p>
-        </w:tc>
-        <w:tc>
-          <w:tcPr>
-            <w:tcW w:w="2784" w:type="dxa"/>
-          </w:tcPr>
-          <w:p/>
+              <w:t xml:space="preserve">For Jack to update his account information, he will have to be logged in to his account. He will then be able to access account </w:t>
+            </w:r>
+            <w:proofErr w:type="gramStart"/>
+            <w:r>
+              <w:t>information,</w:t>
+            </w:r>
+            <w:proofErr w:type="gramEnd"/>
+            <w:r>
+              <w:t xml:space="preserve"> there he could update the delivery address. This feature is needed for </w:t>
+            </w:r>
+            <w:r>
+              <w:lastRenderedPageBreak/>
+              <w:t>people like Jack, that might have moved out from the saved address, and he would like to update it. Being able to update personal information is a right mentioned in the Data Protection Act, therefore the solution must comply with the legislation.</w:t>
+            </w:r>
+          </w:p>
         </w:tc>
       </w:tr>
       <w:tr>
@@ -3277,7 +3338,11 @@
           <w:tcPr>
             <w:tcW w:w="2784" w:type="dxa"/>
           </w:tcPr>
-          <w:p/>
+          <w:p>
+            <w:r>
+              <w:t>Tom wants to view his account information to make sure personal details are correct. If any details are incorrect, issues could happen such as delivery mistakes.</w:t>
+            </w:r>
+          </w:p>
         </w:tc>
       </w:tr>
       <w:tr>
@@ -3305,6 +3370,9 @@
             <w:r>
               <w:t xml:space="preserve"> I want to view my account information so that </w:t>
             </w:r>
+            <w:r>
+              <w:t>I can change my email.</w:t>
+            </w:r>
           </w:p>
         </w:tc>
         <w:tc>
@@ -3424,7 +3492,22 @@
           <w:tcPr>
             <w:tcW w:w="2784" w:type="dxa"/>
           </w:tcPr>
-          <w:p/>
+          <w:p>
+            <w:r>
+              <w:t xml:space="preserve">Merinda has made a new email address and wants to replace her current accounts email to the new one. </w:t>
+            </w:r>
+            <w:r>
+              <w:t xml:space="preserve">She wants to view the account information so she can update it to the new email. Viewing account information is useful since she can update the details all by herself, instead of having to call support and stay online for a simple email update. That is why this feature is efficient and saves both customer and the </w:t>
+            </w:r>
+            <w:proofErr w:type="gramStart"/>
+            <w:r>
+              <w:t>staffs</w:t>
+            </w:r>
+            <w:proofErr w:type="gramEnd"/>
+            <w:r>
+              <w:t xml:space="preserve"> time.</w:t>
+            </w:r>
+          </w:p>
         </w:tc>
       </w:tr>
       <w:tr>
@@ -3542,7 +3625,11 @@
           <w:tcPr>
             <w:tcW w:w="2784" w:type="dxa"/>
           </w:tcPr>
-          <w:p/>
+          <w:p>
+            <w:r>
+              <w:t>Viewing order history lets Merinda reorder previous products she liked quickly. This feature saves her time and convenience when shopping regularly. This will benefit the business by encouraging more sales meaning increased profit.</w:t>
+            </w:r>
+          </w:p>
         </w:tc>
       </w:tr>
       <w:tr>
@@ -3562,7 +3649,11 @@
           </w:tcPr>
           <w:p>
             <w:r>
-              <w:t xml:space="preserve">As Jack I want to view my order history so that I can make sure the products I got delivered are the exact same as ordered. </w:t>
+              <w:t xml:space="preserve">As Jack I want to view my order history so that I can make sure the products I got delivered </w:t>
+            </w:r>
+            <w:r>
+              <w:lastRenderedPageBreak/>
+              <w:t xml:space="preserve">are the exact same as ordered. </w:t>
             </w:r>
           </w:p>
         </w:tc>
@@ -3579,6 +3670,7 @@
               </w:numPr>
             </w:pPr>
             <w:r>
+              <w:lastRenderedPageBreak/>
               <w:t>Find the homepage</w:t>
             </w:r>
           </w:p>
@@ -3639,6 +3731,7 @@
               </w:numPr>
             </w:pPr>
             <w:r>
+              <w:lastRenderedPageBreak/>
               <w:t>Check all the items are correct</w:t>
             </w:r>
           </w:p>
@@ -3647,7 +3740,16 @@
           <w:tcPr>
             <w:tcW w:w="2784" w:type="dxa"/>
           </w:tcPr>
-          <w:p/>
+          <w:p>
+            <w:r>
+              <w:lastRenderedPageBreak/>
+              <w:t xml:space="preserve">Jack has faced delivery problems before from many companies, to reduce the risk of facing issues like these, he could use the order history as proof of his </w:t>
+            </w:r>
+            <w:r>
+              <w:lastRenderedPageBreak/>
+              <w:t>order. He could check if the products he received match the order or not. This way Jack can identify any mistakes easily, this shows that the solution looks only for the satisfaction of the customer.</w:t>
+            </w:r>
+          </w:p>
         </w:tc>
       </w:tr>
       <w:tr>
@@ -3669,6 +3771,12 @@
             <w:r>
               <w:t>As Merinda I want to view products and their availability so that I</w:t>
             </w:r>
+            <w:r>
+              <w:t xml:space="preserve"> can make an informed purchase</w:t>
+            </w:r>
+            <w:r>
+              <w:t>.</w:t>
+            </w:r>
           </w:p>
         </w:tc>
         <w:tc>
@@ -3737,7 +3845,22 @@
           <w:tcPr>
             <w:tcW w:w="2784" w:type="dxa"/>
           </w:tcPr>
-          <w:p/>
+          <w:p>
+            <w:r>
+              <w:t xml:space="preserve">Merinda has some </w:t>
+            </w:r>
+            <w:proofErr w:type="gramStart"/>
+            <w:r>
+              <w:t>allergies,</w:t>
+            </w:r>
+            <w:proofErr w:type="gramEnd"/>
+            <w:r>
+              <w:t xml:space="preserve"> she always needs to view the description of products to make sure she avoids any allergens.</w:t>
+            </w:r>
+            <w:r>
+              <w:t xml:space="preserve"> Therefore, to make an informed purchase, she needs the feature of viewing product listings otherwise her life could be in danger if she purchases harmful products. The solution must comply with the food information regulations, to prevent this from happening.</w:t>
+            </w:r>
+          </w:p>
         </w:tc>
       </w:tr>
       <w:tr>
@@ -3747,7 +3870,6 @@
           </w:tcPr>
           <w:p>
             <w:r>
-              <w:lastRenderedPageBreak/>
               <w:t>Product listings with pricing and availability</w:t>
             </w:r>
           </w:p>
@@ -3758,7 +3880,19 @@
           </w:tcPr>
           <w:p>
             <w:r>
-              <w:t>As Merinda I want to view products and their availability so that I</w:t>
+              <w:t xml:space="preserve">As </w:t>
+            </w:r>
+            <w:r>
+              <w:t>Jack</w:t>
+            </w:r>
+            <w:r>
+              <w:t xml:space="preserve"> I want to view products so that I</w:t>
+            </w:r>
+            <w:r>
+              <w:t xml:space="preserve"> can find out the method of production</w:t>
+            </w:r>
+            <w:r>
+              <w:t>.</w:t>
             </w:r>
           </w:p>
         </w:tc>
@@ -3823,7 +3957,11 @@
           <w:tcPr>
             <w:tcW w:w="2784" w:type="dxa"/>
           </w:tcPr>
-          <w:p/>
+          <w:p>
+            <w:r>
+              <w:t>Jack loves following a healthy style of living, so he goes only for organic products from local producers. But when purchasing he likes to first know what method of production is used. Without that information he will be hesitating to buy the products, the business could lose potential sales if production methods are not specified.</w:t>
+            </w:r>
+          </w:p>
         </w:tc>
       </w:tr>
       <w:tr>
@@ -3845,6 +3983,12 @@
             <w:r>
               <w:t>As Merinda I want to place an order for delivery so that I</w:t>
             </w:r>
+            <w:r>
+              <w:t xml:space="preserve"> do not have to </w:t>
+            </w:r>
+            <w:r>
+              <w:t>visit the local hub.</w:t>
+            </w:r>
           </w:p>
         </w:tc>
         <w:tc>
@@ -3928,7 +4072,23 @@
           <w:tcPr>
             <w:tcW w:w="2784" w:type="dxa"/>
           </w:tcPr>
-          <w:p/>
+          <w:p>
+            <w:r>
+              <w:t xml:space="preserve">This feature is convenient </w:t>
+            </w:r>
+            <w:r>
+              <w:t xml:space="preserve">and makes it accessible </w:t>
+            </w:r>
+            <w:r>
+              <w:t xml:space="preserve">for Merinda since </w:t>
+            </w:r>
+            <w:r>
+              <w:t>she has trouble walking because of her age</w:t>
+            </w:r>
+            <w:r>
+              <w:t xml:space="preserve">. Without delivery options, customers might choose other services that offer delivery options. </w:t>
+            </w:r>
+          </w:p>
         </w:tc>
       </w:tr>
       <w:tr>
@@ -3938,7 +4098,7 @@
           </w:tcPr>
           <w:p>
             <w:r>
-              <w:t>Producer information and local benefits</w:t>
+              <w:t>Order Placement, collection or delivery</w:t>
             </w:r>
           </w:p>
         </w:tc>
@@ -3948,7 +4108,11 @@
           </w:tcPr>
           <w:p>
             <w:r>
-              <w:t>As Jack I want to place an order for collection so that I</w:t>
+              <w:t xml:space="preserve">As Jack I want to place an order for collection so that I can quickly take my order </w:t>
+            </w:r>
+            <w:r>
+              <w:lastRenderedPageBreak/>
+              <w:t>when coming back from work.</w:t>
             </w:r>
           </w:p>
         </w:tc>
@@ -3966,6 +4130,7 @@
               <w:spacing w:after="160" w:line="259" w:lineRule="auto"/>
             </w:pPr>
             <w:r>
+              <w:lastRenderedPageBreak/>
               <w:t>Access the homepage</w:t>
             </w:r>
           </w:p>
@@ -4030,6 +4195,7 @@
               </w:numPr>
             </w:pPr>
             <w:r>
+              <w:lastRenderedPageBreak/>
               <w:t>Confirm order</w:t>
             </w:r>
           </w:p>
@@ -4038,7 +4204,16 @@
           <w:tcPr>
             <w:tcW w:w="2784" w:type="dxa"/>
           </w:tcPr>
-          <w:p/>
+          <w:p>
+            <w:r>
+              <w:lastRenderedPageBreak/>
+              <w:t xml:space="preserve">This feature will be useful for Jack as it allows flexibility, he can avoid delivery waiting times and collect the order at a time that suits him. Providing </w:t>
+            </w:r>
+            <w:r>
+              <w:lastRenderedPageBreak/>
+              <w:t>both delivery and collection makes sure that the solution meets different customer needs, improving their satisfaction.</w:t>
+            </w:r>
+          </w:p>
         </w:tc>
       </w:tr>
       <w:tr>
@@ -4048,7 +4223,7 @@
           </w:tcPr>
           <w:p>
             <w:r>
-              <w:t>Producer stock</w:t>
+              <w:t>Producer information and local benefits</w:t>
             </w:r>
           </w:p>
         </w:tc>
@@ -4058,7 +4233,7 @@
           </w:tcPr>
           <w:p>
             <w:r>
-              <w:t>As Tom I want to manage the products stock level so that I</w:t>
+              <w:t>As Jack I want to view producer information and local benefits so that I can understand where the products come from and support local producers.</w:t>
             </w:r>
           </w:p>
         </w:tc>
@@ -4071,71 +4246,59 @@
               <w:pStyle w:val="ListParagraph"/>
               <w:numPr>
                 <w:ilvl w:val="0"/>
-                <w:numId w:val="34"/>
-              </w:numPr>
-            </w:pPr>
-            <w:r>
-              <w:t>Make sure to login</w:t>
-            </w:r>
-          </w:p>
-          <w:p>
-            <w:pPr>
-              <w:pStyle w:val="ListParagraph"/>
-              <w:numPr>
-                <w:ilvl w:val="0"/>
-                <w:numId w:val="34"/>
-              </w:numPr>
-            </w:pPr>
-            <w:r>
-              <w:t>Navigate to producer dashboard</w:t>
-            </w:r>
-          </w:p>
-          <w:p>
-            <w:pPr>
-              <w:pStyle w:val="ListParagraph"/>
-              <w:numPr>
-                <w:ilvl w:val="0"/>
-                <w:numId w:val="34"/>
-              </w:numPr>
-            </w:pPr>
-            <w:r>
-              <w:t>Select the product management section</w:t>
-            </w:r>
-          </w:p>
-          <w:p>
-            <w:pPr>
-              <w:pStyle w:val="ListParagraph"/>
-              <w:numPr>
-                <w:ilvl w:val="0"/>
-                <w:numId w:val="34"/>
-              </w:numPr>
-            </w:pPr>
-            <w:r>
-              <w:t>Click edit on the selected product</w:t>
-            </w:r>
-          </w:p>
-          <w:p>
-            <w:pPr>
-              <w:pStyle w:val="ListParagraph"/>
-              <w:numPr>
-                <w:ilvl w:val="0"/>
-                <w:numId w:val="34"/>
-              </w:numPr>
-            </w:pPr>
-            <w:r>
-              <w:t>Update stock if needed</w:t>
-            </w:r>
-          </w:p>
-          <w:p>
-            <w:pPr>
-              <w:pStyle w:val="ListParagraph"/>
-              <w:numPr>
-                <w:ilvl w:val="0"/>
-                <w:numId w:val="34"/>
-              </w:numPr>
-            </w:pPr>
-            <w:r>
-              <w:t>Save changes</w:t>
+                <w:numId w:val="33"/>
+              </w:numPr>
+            </w:pPr>
+            <w:r>
+              <w:t>Navigate to producer page</w:t>
+            </w:r>
+          </w:p>
+          <w:p>
+            <w:pPr>
+              <w:pStyle w:val="ListParagraph"/>
+              <w:numPr>
+                <w:ilvl w:val="0"/>
+                <w:numId w:val="33"/>
+              </w:numPr>
+            </w:pPr>
+            <w:r>
+              <w:t>Select a producer</w:t>
+            </w:r>
+          </w:p>
+          <w:p>
+            <w:pPr>
+              <w:pStyle w:val="ListParagraph"/>
+              <w:numPr>
+                <w:ilvl w:val="0"/>
+                <w:numId w:val="33"/>
+              </w:numPr>
+            </w:pPr>
+            <w:r>
+              <w:t>View producer details</w:t>
+            </w:r>
+          </w:p>
+          <w:p>
+            <w:pPr>
+              <w:pStyle w:val="ListParagraph"/>
+              <w:numPr>
+                <w:ilvl w:val="0"/>
+                <w:numId w:val="33"/>
+              </w:numPr>
+            </w:pPr>
+            <w:r>
+              <w:t>View production methods</w:t>
+            </w:r>
+          </w:p>
+          <w:p>
+            <w:pPr>
+              <w:pStyle w:val="ListParagraph"/>
+              <w:numPr>
+                <w:ilvl w:val="0"/>
+                <w:numId w:val="33"/>
+              </w:numPr>
+            </w:pPr>
+            <w:r>
+              <w:t>View local benefits</w:t>
             </w:r>
           </w:p>
         </w:tc>
@@ -4143,7 +4306,14 @@
           <w:tcPr>
             <w:tcW w:w="2784" w:type="dxa"/>
           </w:tcPr>
-          <w:p/>
+          <w:p>
+            <w:r>
+              <w:t>Without the information, Jack might feel uncertain about purchasing, which could lead to lost sales for Greenfield Local Hub.</w:t>
+            </w:r>
+            <w:r>
+              <w:t xml:space="preserve"> This information develops trust between customer and producers and encourages users to support local businesses. This will increase engagement and revenue for the business.</w:t>
+            </w:r>
+          </w:p>
         </w:tc>
       </w:tr>
       <w:tr>
@@ -4153,7 +4323,7 @@
           </w:tcPr>
           <w:p>
             <w:r>
-              <w:t>Product Management Dashboard</w:t>
+              <w:t>Producer stock</w:t>
             </w:r>
           </w:p>
         </w:tc>
@@ -4163,19 +4333,7 @@
           </w:tcPr>
           <w:p>
             <w:r>
-              <w:t xml:space="preserve">As </w:t>
-            </w:r>
-            <w:r>
-              <w:t>Tom</w:t>
-            </w:r>
-            <w:r>
-              <w:t xml:space="preserve"> I want to </w:t>
-            </w:r>
-            <w:r>
-              <w:t>update product details</w:t>
-            </w:r>
-            <w:r>
-              <w:t xml:space="preserve"> so that I</w:t>
+              <w:t>As Tom I want to manage the products stock level so that I can update the stock to an accurate number.</w:t>
             </w:r>
           </w:p>
         </w:tc>
@@ -4190,7 +4348,6 @@
                 <w:ilvl w:val="0"/>
                 <w:numId w:val="34"/>
               </w:numPr>
-              <w:spacing w:after="160" w:line="259" w:lineRule="auto"/>
             </w:pPr>
             <w:r>
               <w:t>Make sure to login</w:t>
@@ -4203,7 +4360,6 @@
                 <w:ilvl w:val="0"/>
                 <w:numId w:val="34"/>
               </w:numPr>
-              <w:spacing w:after="160" w:line="259" w:lineRule="auto"/>
             </w:pPr>
             <w:r>
               <w:t>Navigate to producer dashboard</w:t>
@@ -4216,7 +4372,6 @@
                 <w:ilvl w:val="0"/>
                 <w:numId w:val="34"/>
               </w:numPr>
-              <w:spacing w:after="160" w:line="259" w:lineRule="auto"/>
             </w:pPr>
             <w:r>
               <w:t>Select the product management section</w:t>
@@ -4229,7 +4384,6 @@
                 <w:ilvl w:val="0"/>
                 <w:numId w:val="34"/>
               </w:numPr>
-              <w:spacing w:after="160" w:line="259" w:lineRule="auto"/>
             </w:pPr>
             <w:r>
               <w:t>Click edit on the selected product</w:t>
@@ -4242,10 +4396,9 @@
                 <w:ilvl w:val="0"/>
                 <w:numId w:val="34"/>
               </w:numPr>
-              <w:spacing w:after="160" w:line="259" w:lineRule="auto"/>
-            </w:pPr>
-            <w:r>
-              <w:t>Update the product details</w:t>
+            </w:pPr>
+            <w:r>
+              <w:t>Update stock if needed</w:t>
             </w:r>
           </w:p>
           <w:p>
@@ -4255,7 +4408,6 @@
                 <w:ilvl w:val="0"/>
                 <w:numId w:val="34"/>
               </w:numPr>
-              <w:spacing w:after="160" w:line="259" w:lineRule="auto"/>
             </w:pPr>
             <w:r>
               <w:t>Save changes</w:t>
@@ -4266,7 +4418,14 @@
           <w:tcPr>
             <w:tcW w:w="2784" w:type="dxa"/>
           </w:tcPr>
-          <w:p/>
+          <w:p>
+            <w:r>
+              <w:t xml:space="preserve">Tom needs to update stock levels, if not customers might order products that are not available, which will lead to cancellation of the order and dissatisfaction. This feature helps keeping reliability in the system and </w:t>
+            </w:r>
+            <w:r>
+              <w:t>makes sure that customers get the correct information before buying.</w:t>
+            </w:r>
+          </w:p>
         </w:tc>
       </w:tr>
       <w:tr>
@@ -4276,7 +4435,7 @@
           </w:tcPr>
           <w:p>
             <w:r>
-              <w:t>Order Management</w:t>
+              <w:t>Product Management Dashboard</w:t>
             </w:r>
           </w:p>
         </w:tc>
@@ -4286,10 +4445,7 @@
           </w:tcPr>
           <w:p>
             <w:r>
-              <w:t>As Tom I want to view customer orders so that I</w:t>
-            </w:r>
-            <w:r>
-              <w:t xml:space="preserve"> can manage their status.</w:t>
+              <w:t>As Tom I want to update product details so that I can increase the price.</w:t>
             </w:r>
           </w:p>
         </w:tc>
@@ -4333,7 +4489,7 @@
               <w:spacing w:after="160" w:line="259" w:lineRule="auto"/>
             </w:pPr>
             <w:r>
-              <w:t>Select the order management section</w:t>
+              <w:t>Select the product management section</w:t>
             </w:r>
           </w:p>
           <w:p>
@@ -4346,8 +4502,7 @@
               <w:spacing w:after="160" w:line="259" w:lineRule="auto"/>
             </w:pPr>
             <w:r>
-              <w:lastRenderedPageBreak/>
-              <w:t>View all customer orders</w:t>
+              <w:t>Click edit on the selected product</w:t>
             </w:r>
           </w:p>
           <w:p>
@@ -4360,7 +4515,7 @@
               <w:spacing w:after="160" w:line="259" w:lineRule="auto"/>
             </w:pPr>
             <w:r>
-              <w:t>Change status if needed</w:t>
+              <w:t>Update the product details</w:t>
             </w:r>
           </w:p>
           <w:p>
@@ -4381,7 +4536,11 @@
           <w:tcPr>
             <w:tcW w:w="2784" w:type="dxa"/>
           </w:tcPr>
-          <w:p/>
+          <w:p>
+            <w:r>
+              <w:t>Tom wants to update the prices of his products because of supply costs. To do so he needs access to the product management section in the dashboard as a producer. Without this, Tom will not be profiting anymore if prices are not changed, therefore this functionality is essential for a producer.</w:t>
+            </w:r>
+          </w:p>
         </w:tc>
       </w:tr>
       <w:tr>
@@ -4391,7 +4550,7 @@
           </w:tcPr>
           <w:p>
             <w:r>
-              <w:t>Loyalty Scheme</w:t>
+              <w:t>Order Management</w:t>
             </w:r>
           </w:p>
         </w:tc>
@@ -4401,10 +4560,7 @@
           </w:tcPr>
           <w:p>
             <w:r>
-              <w:t>As Jack I want to get discounts and special offers after purchasing so that I</w:t>
-            </w:r>
-            <w:r>
-              <w:t xml:space="preserve"> can save money.</w:t>
+              <w:t>As Tom I want to view customer orders so that I can manage their status.</w:t>
             </w:r>
           </w:p>
         </w:tc>
@@ -4417,62 +4573,77 @@
               <w:pStyle w:val="ListParagraph"/>
               <w:numPr>
                 <w:ilvl w:val="0"/>
-                <w:numId w:val="35"/>
-              </w:numPr>
-            </w:pPr>
-            <w:r>
-              <w:t>Successfully make an order</w:t>
-            </w:r>
-          </w:p>
-          <w:p>
-            <w:pPr>
-              <w:pStyle w:val="ListParagraph"/>
-              <w:numPr>
-                <w:ilvl w:val="0"/>
-                <w:numId w:val="35"/>
-              </w:numPr>
-            </w:pPr>
-            <w:r>
-              <w:t>Navigate to account</w:t>
-            </w:r>
-          </w:p>
-          <w:p>
-            <w:pPr>
-              <w:pStyle w:val="ListParagraph"/>
-              <w:numPr>
-                <w:ilvl w:val="0"/>
-                <w:numId w:val="35"/>
-              </w:numPr>
-            </w:pPr>
-            <w:r>
-              <w:t>Select My Loyalty section</w:t>
-            </w:r>
-          </w:p>
-          <w:p>
-            <w:pPr>
-              <w:pStyle w:val="ListParagraph"/>
-              <w:numPr>
-                <w:ilvl w:val="0"/>
-                <w:numId w:val="35"/>
-              </w:numPr>
-            </w:pPr>
-            <w:r>
-              <w:t>View loyalty points received</w:t>
-            </w:r>
-            <w:r>
-              <w:t xml:space="preserve"> from purchase</w:t>
-            </w:r>
-          </w:p>
-          <w:p>
-            <w:pPr>
-              <w:pStyle w:val="ListParagraph"/>
-              <w:numPr>
-                <w:ilvl w:val="0"/>
-                <w:numId w:val="35"/>
-              </w:numPr>
-            </w:pPr>
-            <w:r>
-              <w:t>Redeem offers with loyalty points</w:t>
+                <w:numId w:val="34"/>
+              </w:numPr>
+              <w:spacing w:after="160" w:line="259" w:lineRule="auto"/>
+            </w:pPr>
+            <w:r>
+              <w:t>Make sure to login</w:t>
+            </w:r>
+          </w:p>
+          <w:p>
+            <w:pPr>
+              <w:pStyle w:val="ListParagraph"/>
+              <w:numPr>
+                <w:ilvl w:val="0"/>
+                <w:numId w:val="34"/>
+              </w:numPr>
+              <w:spacing w:after="160" w:line="259" w:lineRule="auto"/>
+            </w:pPr>
+            <w:r>
+              <w:t>Navigate to producer dashboard</w:t>
+            </w:r>
+          </w:p>
+          <w:p>
+            <w:pPr>
+              <w:pStyle w:val="ListParagraph"/>
+              <w:numPr>
+                <w:ilvl w:val="0"/>
+                <w:numId w:val="34"/>
+              </w:numPr>
+              <w:spacing w:after="160" w:line="259" w:lineRule="auto"/>
+            </w:pPr>
+            <w:r>
+              <w:t>Select the order management section</w:t>
+            </w:r>
+          </w:p>
+          <w:p>
+            <w:pPr>
+              <w:pStyle w:val="ListParagraph"/>
+              <w:numPr>
+                <w:ilvl w:val="0"/>
+                <w:numId w:val="34"/>
+              </w:numPr>
+              <w:spacing w:after="160" w:line="259" w:lineRule="auto"/>
+            </w:pPr>
+            <w:r>
+              <w:t>View all customer orders</w:t>
+            </w:r>
+          </w:p>
+          <w:p>
+            <w:pPr>
+              <w:pStyle w:val="ListParagraph"/>
+              <w:numPr>
+                <w:ilvl w:val="0"/>
+                <w:numId w:val="34"/>
+              </w:numPr>
+              <w:spacing w:after="160" w:line="259" w:lineRule="auto"/>
+            </w:pPr>
+            <w:r>
+              <w:t>Change status if needed</w:t>
+            </w:r>
+          </w:p>
+          <w:p>
+            <w:pPr>
+              <w:pStyle w:val="ListParagraph"/>
+              <w:numPr>
+                <w:ilvl w:val="0"/>
+                <w:numId w:val="34"/>
+              </w:numPr>
+              <w:spacing w:after="160" w:line="259" w:lineRule="auto"/>
+            </w:pPr>
+            <w:r>
+              <w:t>Save changes</w:t>
             </w:r>
           </w:p>
         </w:tc>
@@ -4480,7 +4651,11 @@
           <w:tcPr>
             <w:tcW w:w="2784" w:type="dxa"/>
           </w:tcPr>
-          <w:p/>
+          <w:p>
+            <w:r>
+              <w:t>Tom needs to be able to view customer orders so that he can manage their status. This feature helps organising orders and quickly sendoff orders without delay. This will enhance the customer experience.</w:t>
+            </w:r>
+          </w:p>
         </w:tc>
       </w:tr>
       <w:tr>
@@ -4500,10 +4675,11 @@
           </w:tcPr>
           <w:p>
             <w:r>
-              <w:t>As Merinda I want to get discounts and special offers after purchasing so that I</w:t>
-            </w:r>
-            <w:r>
-              <w:t xml:space="preserve"> can continue to buy from the local producers.</w:t>
+              <w:t xml:space="preserve">As Jack I want to get discounts </w:t>
+            </w:r>
+            <w:r>
+              <w:lastRenderedPageBreak/>
+              <w:t>and special offers after purchasing so that I can save money.</w:t>
             </w:r>
           </w:p>
         </w:tc>
@@ -4518,9 +4694,9 @@
                 <w:ilvl w:val="0"/>
                 <w:numId w:val="35"/>
               </w:numPr>
-              <w:spacing w:after="160" w:line="259" w:lineRule="auto"/>
-            </w:pPr>
-            <w:r>
+            </w:pPr>
+            <w:r>
+              <w:lastRenderedPageBreak/>
               <w:t>Successfully make an order</w:t>
             </w:r>
           </w:p>
@@ -4531,9 +4707,9 @@
                 <w:ilvl w:val="0"/>
                 <w:numId w:val="35"/>
               </w:numPr>
-              <w:spacing w:after="160" w:line="259" w:lineRule="auto"/>
-            </w:pPr>
-            <w:r>
+            </w:pPr>
+            <w:r>
+              <w:lastRenderedPageBreak/>
               <w:t>Navigate to account</w:t>
             </w:r>
           </w:p>
@@ -4544,7 +4720,6 @@
                 <w:ilvl w:val="0"/>
                 <w:numId w:val="35"/>
               </w:numPr>
-              <w:spacing w:after="160" w:line="259" w:lineRule="auto"/>
             </w:pPr>
             <w:r>
               <w:t>Select My Loyalty section</w:t>
@@ -4557,7 +4732,6 @@
                 <w:ilvl w:val="0"/>
                 <w:numId w:val="35"/>
               </w:numPr>
-              <w:spacing w:after="160" w:line="259" w:lineRule="auto"/>
             </w:pPr>
             <w:r>
               <w:t>View loyalty points received from purchase</w:t>
@@ -4570,7 +4744,6 @@
                 <w:ilvl w:val="0"/>
                 <w:numId w:val="35"/>
               </w:numPr>
-              <w:spacing w:after="160" w:line="259" w:lineRule="auto"/>
             </w:pPr>
             <w:r>
               <w:t>Redeem offers with loyalty points</w:t>
@@ -4581,7 +4754,16 @@
           <w:tcPr>
             <w:tcW w:w="2784" w:type="dxa"/>
           </w:tcPr>
-          <w:p/>
+          <w:p>
+            <w:r>
+              <w:lastRenderedPageBreak/>
+              <w:t xml:space="preserve">This feature encourages Jack to keep purchasing from the </w:t>
+            </w:r>
+            <w:r>
+              <w:lastRenderedPageBreak/>
+              <w:t xml:space="preserve">site because of the rewards. The loyalty scheme will help increase customer retention and make users feel compensated for their activity, this will benefit the business through increased sales. </w:t>
+            </w:r>
+          </w:p>
         </w:tc>
       </w:tr>
       <w:tr>
@@ -4591,7 +4773,8 @@
           </w:tcPr>
           <w:p>
             <w:r>
-              <w:t>Accessibility Features</w:t>
+              <w:lastRenderedPageBreak/>
+              <w:t>Loyalty Scheme</w:t>
             </w:r>
           </w:p>
         </w:tc>
@@ -4601,10 +4784,7 @@
           </w:tcPr>
           <w:p>
             <w:r>
-              <w:t>As Merinda I want to have access to accessibility features so that I</w:t>
-            </w:r>
-            <w:r>
-              <w:t xml:space="preserve"> can increase the text size for easier readability.</w:t>
+              <w:t>As Merinda I want to get discounts and special offers after purchasing so that I can continue to buy from the local producers.</w:t>
             </w:r>
           </w:p>
         </w:tc>
@@ -4617,16 +4797,79 @@
               <w:pStyle w:val="ListParagraph"/>
               <w:numPr>
                 <w:ilvl w:val="0"/>
-                <w:numId w:val="37"/>
-              </w:numPr>
-            </w:pPr>
+                <w:numId w:val="35"/>
+              </w:numPr>
+              <w:spacing w:after="160" w:line="259" w:lineRule="auto"/>
+            </w:pPr>
+            <w:r>
+              <w:t>Successfully make an order</w:t>
+            </w:r>
+          </w:p>
+          <w:p>
+            <w:pPr>
+              <w:pStyle w:val="ListParagraph"/>
+              <w:numPr>
+                <w:ilvl w:val="0"/>
+                <w:numId w:val="35"/>
+              </w:numPr>
+              <w:spacing w:after="160" w:line="259" w:lineRule="auto"/>
+            </w:pPr>
+            <w:r>
+              <w:t>Navigate to account</w:t>
+            </w:r>
+          </w:p>
+          <w:p>
+            <w:pPr>
+              <w:pStyle w:val="ListParagraph"/>
+              <w:numPr>
+                <w:ilvl w:val="0"/>
+                <w:numId w:val="35"/>
+              </w:numPr>
+              <w:spacing w:after="160" w:line="259" w:lineRule="auto"/>
+            </w:pPr>
+            <w:r>
+              <w:t>Select My Loyalty section</w:t>
+            </w:r>
+          </w:p>
+          <w:p>
+            <w:pPr>
+              <w:pStyle w:val="ListParagraph"/>
+              <w:numPr>
+                <w:ilvl w:val="0"/>
+                <w:numId w:val="35"/>
+              </w:numPr>
+              <w:spacing w:after="160" w:line="259" w:lineRule="auto"/>
+            </w:pPr>
+            <w:r>
+              <w:t>View loyalty points received from purchase</w:t>
+            </w:r>
+          </w:p>
+          <w:p>
+            <w:pPr>
+              <w:pStyle w:val="ListParagraph"/>
+              <w:numPr>
+                <w:ilvl w:val="0"/>
+                <w:numId w:val="35"/>
+              </w:numPr>
+              <w:spacing w:after="160" w:line="259" w:lineRule="auto"/>
+            </w:pPr>
+            <w:r>
+              <w:t>Redeem offers with loyalty points</w:t>
+            </w:r>
           </w:p>
         </w:tc>
         <w:tc>
           <w:tcPr>
             <w:tcW w:w="2784" w:type="dxa"/>
           </w:tcPr>
-          <w:p/>
+          <w:p>
+            <w:r>
+              <w:t xml:space="preserve">This feature motivates Merinda to return </w:t>
+            </w:r>
+            <w:r>
+              <w:t>to the platform regularly. It develops customer loyalty and promotes repeat purchases which helps the business grow.</w:t>
+            </w:r>
+          </w:p>
         </w:tc>
       </w:tr>
       <w:tr>
@@ -4646,10 +4889,7 @@
           </w:tcPr>
           <w:p>
             <w:r>
-              <w:t>As Jack I want to have access to accessibility features so that I can turn the website into dark mode</w:t>
-            </w:r>
-            <w:r>
-              <w:t>.</w:t>
+              <w:t>As Merinda I want to have access to accessibility features so that I can increase the text size for easier readability.</w:t>
             </w:r>
           </w:p>
         </w:tc>
@@ -4662,16 +4902,123 @@
               <w:pStyle w:val="ListParagraph"/>
               <w:numPr>
                 <w:ilvl w:val="0"/>
+                <w:numId w:val="37"/>
+              </w:numPr>
+            </w:pPr>
+            <w:r>
+              <w:t>Find accessibility header above navigation bar</w:t>
+            </w:r>
+          </w:p>
+          <w:p>
+            <w:pPr>
+              <w:pStyle w:val="ListParagraph"/>
+              <w:numPr>
+                <w:ilvl w:val="0"/>
+                <w:numId w:val="37"/>
+              </w:numPr>
+            </w:pPr>
+            <w:r>
+              <w:t>Hover on button for dropdown menu</w:t>
+            </w:r>
+          </w:p>
+          <w:p>
+            <w:pPr>
+              <w:pStyle w:val="ListParagraph"/>
+              <w:numPr>
+                <w:ilvl w:val="0"/>
+                <w:numId w:val="37"/>
+              </w:numPr>
+            </w:pPr>
+            <w:r>
+              <w:t>Choose increase text size</w:t>
+            </w:r>
+          </w:p>
+        </w:tc>
+        <w:tc>
+          <w:tcPr>
+            <w:tcW w:w="2784" w:type="dxa"/>
+          </w:tcPr>
+          <w:p>
+            <w:r>
+              <w:t>Merinda has visual difficulties and this feature helps her navigate through the platform easier and it makes her feel more included. She will appreciate the business more making her become a loyal customer.</w:t>
+            </w:r>
+          </w:p>
+        </w:tc>
+      </w:tr>
+      <w:tr>
+        <w:tc>
+          <w:tcPr>
+            <w:tcW w:w="1523" w:type="dxa"/>
+          </w:tcPr>
+          <w:p>
+            <w:r>
+              <w:t>Accessibility Features</w:t>
+            </w:r>
+          </w:p>
+        </w:tc>
+        <w:tc>
+          <w:tcPr>
+            <w:tcW w:w="1733" w:type="dxa"/>
+          </w:tcPr>
+          <w:p>
+            <w:r>
+              <w:t>As Jack I want to have access to accessibility features so that I can turn the website into dark mode.</w:t>
+            </w:r>
+          </w:p>
+        </w:tc>
+        <w:tc>
+          <w:tcPr>
+            <w:tcW w:w="2976" w:type="dxa"/>
+          </w:tcPr>
+          <w:p>
+            <w:pPr>
+              <w:pStyle w:val="ListParagraph"/>
+              <w:numPr>
+                <w:ilvl w:val="0"/>
+                <w:numId w:val="37"/>
+              </w:numPr>
+            </w:pPr>
+            <w:r>
+              <w:t>Find accessibility header above navigation bar</w:t>
+            </w:r>
+          </w:p>
+          <w:p>
+            <w:pPr>
+              <w:pStyle w:val="ListParagraph"/>
+              <w:numPr>
+                <w:ilvl w:val="0"/>
+                <w:numId w:val="37"/>
+              </w:numPr>
+            </w:pPr>
+            <w:r>
+              <w:t>Hover on button for dropdown menu</w:t>
+            </w:r>
+          </w:p>
+          <w:p>
+            <w:pPr>
+              <w:pStyle w:val="ListParagraph"/>
+              <w:numPr>
+                <w:ilvl w:val="0"/>
                 <w:numId w:val="36"/>
               </w:numPr>
             </w:pPr>
+            <w:r>
+              <w:t xml:space="preserve">Choose </w:t>
+            </w:r>
+            <w:r>
+              <w:t>dark mode</w:t>
+            </w:r>
           </w:p>
         </w:tc>
         <w:tc>
           <w:tcPr>
             <w:tcW w:w="2784" w:type="dxa"/>
           </w:tcPr>
-          <w:p/>
+          <w:p>
+            <w:r>
+              <w:t>Turning the website to dark mode helps reduce eye strain, especially when using the website for long periods. Adding features like these makes the platform more comfortable to use for different types of users.</w:t>
+            </w:r>
+          </w:p>
         </w:tc>
       </w:tr>
     </w:tbl>
@@ -4684,14 +5031,13 @@
     <w:p/>
     <w:p/>
     <w:p/>
-    <w:p/>
-    <w:p/>
     <w:p>
       <w:pPr>
         <w:pStyle w:val="Heading1"/>
       </w:pPr>
       <w:bookmarkStart w:id="4" w:name="_Toc224242722"/>
       <w:r>
+        <w:lastRenderedPageBreak/>
         <w:t>Non-Functional Requirements</w:t>
       </w:r>
       <w:bookmarkEnd w:id="4"/>
@@ -5113,7 +5459,6 @@
                 <w:sz w:val="32"/>
                 <w:szCs w:val="32"/>
               </w:rPr>
-              <w:lastRenderedPageBreak/>
               <w:t>Security</w:t>
             </w:r>
           </w:p>
@@ -5197,7 +5542,11 @@
           </w:tcPr>
           <w:p>
             <w:r>
-              <w:t>Authorisation must be implemented to make sure only the right users can access some areas of the solution. As an example, only the producers and staff should be able to handle their products and stock, and customers should only be allowed to handle their accounts and orders.</w:t>
+              <w:t xml:space="preserve">Authorisation must be implemented to make sure only the right users can access </w:t>
+            </w:r>
+            <w:r>
+              <w:lastRenderedPageBreak/>
+              <w:t>some areas of the solution. As an example, only the producers and staff should be able to handle their products and stock, and customers should only be allowed to handle their accounts and orders.</w:t>
             </w:r>
           </w:p>
         </w:tc>
@@ -5214,6 +5563,7 @@
               </w:numPr>
             </w:pPr>
             <w:r>
+              <w:lastRenderedPageBreak/>
               <w:t>100% of users must be logged in before being able to access restricted pages.</w:t>
             </w:r>
           </w:p>
@@ -5226,6 +5576,7 @@
               </w:numPr>
             </w:pPr>
             <w:r>
+              <w:lastRenderedPageBreak/>
               <w:t>Role-based access should be applied to all admin/producer features.</w:t>
             </w:r>
           </w:p>
@@ -5266,6 +5617,7 @@
           </w:tcPr>
           <w:p>
             <w:r>
+              <w:lastRenderedPageBreak/>
               <w:t>Unauthorised access prevention</w:t>
             </w:r>
           </w:p>
@@ -5576,7 +5928,6 @@
           </w:tcPr>
           <w:p>
             <w:r>
-              <w:lastRenderedPageBreak/>
               <w:t>Order processing capacity</w:t>
             </w:r>
           </w:p>
@@ -5636,6 +5987,7 @@
           </w:tcPr>
           <w:p>
             <w:r>
+              <w:lastRenderedPageBreak/>
               <w:t>Load tolerance</w:t>
             </w:r>
           </w:p>
@@ -6022,7 +6374,6 @@
               </w:numPr>
             </w:pPr>
             <w:r>
-              <w:lastRenderedPageBreak/>
               <w:t>There should be no data conflicts during simultaneous transactions.</w:t>
             </w:r>
           </w:p>
@@ -6035,54 +6386,54 @@
           </w:tcPr>
           <w:p>
             <w:r>
+              <w:t>Responsiveness</w:t>
+            </w:r>
+          </w:p>
+        </w:tc>
+        <w:tc>
+          <w:tcPr>
+            <w:tcW w:w="3005" w:type="dxa"/>
+          </w:tcPr>
+          <w:p/>
+        </w:tc>
+        <w:tc>
+          <w:tcPr>
+            <w:tcW w:w="3006" w:type="dxa"/>
+          </w:tcPr>
+          <w:p>
+            <w:pPr>
+              <w:pStyle w:val="ListParagraph"/>
+              <w:numPr>
+                <w:ilvl w:val="0"/>
+                <w:numId w:val="26"/>
+              </w:numPr>
+            </w:pPr>
+            <w:r>
+              <w:t>The solution should respond to user actions within 2 seconds.</w:t>
+            </w:r>
+          </w:p>
+          <w:p>
+            <w:pPr>
+              <w:pStyle w:val="ListParagraph"/>
+              <w:numPr>
+                <w:ilvl w:val="0"/>
+                <w:numId w:val="26"/>
+              </w:numPr>
+            </w:pPr>
+            <w:r>
+              <w:t>Buttons and forms react within 1 second,</w:t>
+            </w:r>
+          </w:p>
+          <w:p>
+            <w:pPr>
+              <w:pStyle w:val="ListParagraph"/>
+              <w:numPr>
+                <w:ilvl w:val="0"/>
+                <w:numId w:val="26"/>
+              </w:numPr>
+            </w:pPr>
+            <w:r>
               <w:lastRenderedPageBreak/>
-              <w:t>Responsiveness</w:t>
-            </w:r>
-          </w:p>
-        </w:tc>
-        <w:tc>
-          <w:tcPr>
-            <w:tcW w:w="3005" w:type="dxa"/>
-          </w:tcPr>
-          <w:p/>
-        </w:tc>
-        <w:tc>
-          <w:tcPr>
-            <w:tcW w:w="3006" w:type="dxa"/>
-          </w:tcPr>
-          <w:p>
-            <w:pPr>
-              <w:pStyle w:val="ListParagraph"/>
-              <w:numPr>
-                <w:ilvl w:val="0"/>
-                <w:numId w:val="26"/>
-              </w:numPr>
-            </w:pPr>
-            <w:r>
-              <w:t>The solution should respond to user actions within 2 seconds.</w:t>
-            </w:r>
-          </w:p>
-          <w:p>
-            <w:pPr>
-              <w:pStyle w:val="ListParagraph"/>
-              <w:numPr>
-                <w:ilvl w:val="0"/>
-                <w:numId w:val="26"/>
-              </w:numPr>
-            </w:pPr>
-            <w:r>
-              <w:t>Buttons and forms react within 1 second,</w:t>
-            </w:r>
-          </w:p>
-          <w:p>
-            <w:pPr>
-              <w:pStyle w:val="ListParagraph"/>
-              <w:numPr>
-                <w:ilvl w:val="0"/>
-                <w:numId w:val="26"/>
-              </w:numPr>
-            </w:pPr>
-            <w:r>
               <w:t>The mobile and desktop response times remain consistent.</w:t>
             </w:r>
           </w:p>
@@ -6095,6 +6446,7 @@
           </w:tcPr>
           <w:p>
             <w:r>
+              <w:lastRenderedPageBreak/>
               <w:t>Data capacity</w:t>
             </w:r>
           </w:p>
@@ -6602,7 +6954,6 @@
           </w:tcPr>
           <w:p>
             <w:r>
-              <w:lastRenderedPageBreak/>
               <w:t>Consistent layout</w:t>
             </w:r>
           </w:p>
@@ -6691,6 +7042,7 @@
               </w:numPr>
             </w:pPr>
             <w:r>
+              <w:lastRenderedPageBreak/>
               <w:t>Users can make a purchase under 5 steps.</w:t>
             </w:r>
           </w:p>
@@ -6715,6 +7067,7 @@
           </w:tcPr>
           <w:p>
             <w:r>
+              <w:lastRenderedPageBreak/>
               <w:t>Intuitive navigation</w:t>
             </w:r>
           </w:p>
@@ -7086,6 +7439,7 @@
         <w:rPr>
           <w:noProof/>
         </w:rPr>
+        <w:lastRenderedPageBreak/>
         <w:drawing>
           <wp:inline distT="0" distB="0" distL="0" distR="0" wp14:anchorId="430B06B4" wp14:editId="2E61D43A">
             <wp:extent cx="4440728" cy="2765146"/>
@@ -7484,14 +7838,7 @@
         <w:rPr>
           <w:rFonts w:ascii="Calibri" w:hAnsi="Calibri" w:cs="Calibri"/>
         </w:rPr>
-        <w:t xml:space="preserve"> maintaining the consistency throughout </w:t>
-      </w:r>
-      <w:r>
-        <w:rPr>
-          <w:rFonts w:ascii="Calibri" w:hAnsi="Calibri" w:cs="Calibri"/>
-        </w:rPr>
-        <w:lastRenderedPageBreak/>
-        <w:t xml:space="preserve">the pages and </w:t>
+        <w:t xml:space="preserve"> maintaining the consistency throughout the pages and </w:t>
       </w:r>
       <w:r>
         <w:rPr>
@@ -7517,6 +7864,7 @@
       </w:pPr>
       <w:bookmarkStart w:id="8" w:name="_Toc224242726"/>
       <w:r>
+        <w:lastRenderedPageBreak/>
         <w:t>Risk Matrix</w:t>
       </w:r>
       <w:bookmarkEnd w:id="8"/>
@@ -8591,7 +8939,6 @@
           </w:tcPr>
           <w:p>
             <w:r>
-              <w:lastRenderedPageBreak/>
               <w:t>R2</w:t>
             </w:r>
           </w:p>
@@ -8627,6 +8974,7 @@
           </w:tcPr>
           <w:p>
             <w:r>
+              <w:lastRenderedPageBreak/>
               <w:t>R3</w:t>
             </w:r>
           </w:p>
@@ -8810,6 +9158,7 @@
                 <w:sz w:val="28"/>
                 <w:szCs w:val="28"/>
               </w:rPr>
+              <w:lastRenderedPageBreak/>
               <w:t>Legislation</w:t>
             </w:r>
           </w:p>
@@ -9137,22 +9486,22 @@
               <w:t>es</w:t>
             </w:r>
             <w:r>
-              <w:t xml:space="preserve"> to make sure that people with disabilities can access services </w:t>
+              <w:t xml:space="preserve"> to make sure that people with disabilities can access services successfully. </w:t>
+            </w:r>
+            <w:proofErr w:type="gramStart"/>
+            <w:r>
+              <w:t>In order for</w:t>
+            </w:r>
+            <w:proofErr w:type="gramEnd"/>
+            <w:r>
+              <w:t xml:space="preserve"> business to meet this they must follow the accessibility guidelines such as Web Content Accessibility Guidelines (WCAG). </w:t>
+            </w:r>
+            <w:r>
+              <w:t xml:space="preserve">Features that help make sure that all users can access and use the solution effectively are readable text, clear </w:t>
             </w:r>
             <w:r>
               <w:lastRenderedPageBreak/>
-              <w:t xml:space="preserve">successfully. </w:t>
-            </w:r>
-            <w:proofErr w:type="gramStart"/>
-            <w:r>
-              <w:t>In order for</w:t>
-            </w:r>
-            <w:proofErr w:type="gramEnd"/>
-            <w:r>
-              <w:t xml:space="preserve"> business to meet this they must follow the accessibility guidelines such as Web Content Accessibility Guidelines (WCAG). </w:t>
-            </w:r>
-            <w:r>
-              <w:t>Features that help make sure that all users can access and use the solution effectively are readable text, clear navigation and compatibility with screen readers. Including accessibility features will support inclusivity and makes sure that the business does not unintentionally exclude certain users.</w:t>
+              <w:t>navigation and compatibility with screen readers. Including accessibility features will support inclusivity and makes sure that the business does not unintentionally exclude certain users.</w:t>
             </w:r>
             <w:r>
               <w:t xml:space="preserve"> The solution will include high contrast mode, dark mode, text size increase/decrease to ensure readability. The solution will also be compatible with screen readers and included as an accessibility feature. </w:t>
@@ -14000,7 +14349,6 @@
   <w:style w:type="character" w:default="1" w:styleId="DefaultParagraphFont">
     <w:name w:val="Default Paragraph Font"/>
     <w:uiPriority w:val="1"/>
-    <w:semiHidden/>
     <w:unhideWhenUsed/>
   </w:style>
   <w:style w:type="table" w:default="1" w:styleId="TableNormal">
@@ -14428,7 +14776,9 @@
     <w:rsid w:val="00755A77"/>
     <w:rsid w:val="00756B62"/>
     <w:rsid w:val="00917A83"/>
+    <w:rsid w:val="009C0689"/>
     <w:rsid w:val="009D2B66"/>
+    <w:rsid w:val="009F1E87"/>
     <w:rsid w:val="009F7D5F"/>
     <w:rsid w:val="00B03F3A"/>
     <w:rsid w:val="00B246F6"/>

</xml_diff>

<commit_message>
Day 6 exam morning
Before exam
</commit_message>
<xml_diff>
--- a/Task 1/Task 1a/Task1_Proposal_LL-000020914_Naser_A.docx
+++ b/Task 1/Task 1a/Task1_Proposal_LL-000020914_Naser_A.docx
@@ -1407,15 +1407,7 @@
       </w:r>
       <w:r>
         <w:lastRenderedPageBreak/>
-        <w:t xml:space="preserve">to manage and update their account details, </w:t>
-      </w:r>
-      <w:proofErr w:type="gramStart"/>
-      <w:r>
-        <w:t>in order to</w:t>
-      </w:r>
-      <w:proofErr w:type="gramEnd"/>
-      <w:r>
-        <w:t xml:space="preserve"> make their information successfully up to date. They also appreciate the ability to find their past purchases and reorder items that they liked, and without these functionalities they may feel frustrated or disappointed. This could lead to </w:t>
+        <w:t xml:space="preserve">to manage and update their account details, in order to make their information successfully up to date. They also appreciate the ability to find their past purchases and reorder items that they liked, and without these functionalities they may feel frustrated or disappointed. This could lead to </w:t>
       </w:r>
       <w:r>
         <w:t xml:space="preserve">a loss of customer trust and loyalty, which can result in negative reviews, less sales and even giving competitors with these features an advantage. By allowing customers to manage their accounts and track their orders easily, the digital solution will offer a more personalised and efficient user experience. </w:t>
@@ -1488,15 +1480,7 @@
         <w:t xml:space="preserve">The client wants the solution to include a producer dashboard that makes producers able to manage their stock levels, update product detail and view orders. A professional, industry standard solution should allow producers to efficiently update their available products and quantities. Without this valuable functionality, stock information may have a higher chance of becoming inaccurate or outdated, this could eventually lead to customers ordering products that </w:t>
       </w:r>
       <w:r>
-        <w:t xml:space="preserve">are </w:t>
-      </w:r>
-      <w:proofErr w:type="gramStart"/>
-      <w:r>
-        <w:t>in reality not</w:t>
-      </w:r>
-      <w:proofErr w:type="gramEnd"/>
-      <w:r>
-        <w:t xml:space="preserve"> available. This will cause frustration and trouble keeping things running smoothly. By providing a producer management dashboard personalised for each producer, updating the stock, prices, and product details would be easy and more efficient for producers. This will </w:t>
+        <w:t xml:space="preserve">are in reality not available. This will cause frustration and trouble keeping things running smoothly. By providing a producer management dashboard personalised for each producer, updating the stock, prices, and product details would be easy and more efficient for producers. This will </w:t>
       </w:r>
       <w:r>
         <w:t xml:space="preserve">contribute to accurate listings, and a maintained reliable shopping experience for customers. </w:t>
@@ -2004,15 +1988,7 @@
         <w:t>U</w:t>
       </w:r>
       <w:r>
-        <w:t xml:space="preserve">nfortunately, she has weak </w:t>
-      </w:r>
-      <w:proofErr w:type="gramStart"/>
-      <w:r>
-        <w:t>vision</w:t>
-      </w:r>
-      <w:proofErr w:type="gramEnd"/>
-      <w:r>
-        <w:t xml:space="preserve"> so she needs clear</w:t>
+        <w:t>nfortunately, she has weak vision so she needs clear</w:t>
       </w:r>
       <w:r>
         <w:t>,</w:t>
@@ -2753,15 +2729,7 @@
           </w:tcPr>
           <w:p>
             <w:r>
-              <w:t xml:space="preserve">Jack wants to register because he wants to be able to place orders, get loyalty points, view his orders and track them. An account is very important to any </w:t>
-            </w:r>
-            <w:proofErr w:type="gramStart"/>
-            <w:r>
-              <w:t>user,</w:t>
-            </w:r>
-            <w:proofErr w:type="gramEnd"/>
-            <w:r>
-              <w:t xml:space="preserve"> it makes their user experience much improved.</w:t>
+              <w:t>Jack wants to register because he wants to be able to place orders, get loyalty points, view his orders and track them. An account is very important to any user, it makes their user experience much improved.</w:t>
             </w:r>
           </w:p>
         </w:tc>
@@ -3066,21 +3034,8 @@
             <w:tcW w:w="2784" w:type="dxa"/>
           </w:tcPr>
           <w:p>
-            <w:proofErr w:type="gramStart"/>
-            <w:r>
-              <w:t>In order for</w:t>
-            </w:r>
-            <w:proofErr w:type="gramEnd"/>
-            <w:r>
-              <w:t xml:space="preserve"> Jack to view his </w:t>
-            </w:r>
-            <w:proofErr w:type="gramStart"/>
-            <w:r>
-              <w:t>saved up</w:t>
-            </w:r>
-            <w:proofErr w:type="gramEnd"/>
-            <w:r>
-              <w:t xml:space="preserve"> loyalty points, view his previous orders, place orders and track them he will need to log in to his existing account. The saved data from previous sessions are only accessible when logged in.</w:t>
+            <w:r>
+              <w:t>In order for Jack to view his saved up loyalty points, view his previous orders, place orders and track them he will need to log in to his existing account. The saved data from previous sessions are only accessible when logged in.</w:t>
             </w:r>
           </w:p>
         </w:tc>
@@ -3242,15 +3197,7 @@
           <w:p>
             <w:r>
               <w:lastRenderedPageBreak/>
-              <w:t xml:space="preserve">For Jack to update his account information, he will have to be logged in to his account. He will then be able to access account </w:t>
-            </w:r>
-            <w:proofErr w:type="gramStart"/>
-            <w:r>
-              <w:t>information,</w:t>
-            </w:r>
-            <w:proofErr w:type="gramEnd"/>
-            <w:r>
-              <w:t xml:space="preserve"> there he could update the delivery address. This feature is needed for </w:t>
+              <w:t xml:space="preserve">For Jack to update his account information, he will have to be logged in to his account. He will then be able to access account information, there he could update the delivery address. This feature is needed for </w:t>
             </w:r>
             <w:r>
               <w:lastRenderedPageBreak/>
@@ -3266,6 +3213,7 @@
           </w:tcPr>
           <w:p>
             <w:r>
+              <w:lastRenderedPageBreak/>
               <w:t>Account Information</w:t>
             </w:r>
           </w:p>
@@ -3497,15 +3445,7 @@
               <w:t xml:space="preserve">Merinda has made a new email address and wants to replace her current accounts email to the new one. </w:t>
             </w:r>
             <w:r>
-              <w:t xml:space="preserve">She wants to view the account information so she can update it to the new email. Viewing account information is useful since she can update the details all by herself, instead of having to call support and stay online for a simple email update. That is why this feature is efficient and saves both customer and the </w:t>
-            </w:r>
-            <w:proofErr w:type="gramStart"/>
-            <w:r>
-              <w:t>staffs</w:t>
-            </w:r>
-            <w:proofErr w:type="gramEnd"/>
-            <w:r>
-              <w:t xml:space="preserve"> time.</w:t>
+              <w:t>She wants to view the account information so she can update it to the new email. Viewing account information is useful since she can update the details all by herself, instead of having to call support and stay online for a simple email update. That is why this feature is efficient and saves both customer and the staffs time.</w:t>
             </w:r>
           </w:p>
         </w:tc>
@@ -3759,6 +3699,7 @@
           </w:tcPr>
           <w:p>
             <w:r>
+              <w:lastRenderedPageBreak/>
               <w:t>Product listings with pricing and availability</w:t>
             </w:r>
           </w:p>
@@ -3847,15 +3788,7 @@
           </w:tcPr>
           <w:p>
             <w:r>
-              <w:t xml:space="preserve">Merinda has some </w:t>
-            </w:r>
-            <w:proofErr w:type="gramStart"/>
-            <w:r>
-              <w:t>allergies,</w:t>
-            </w:r>
-            <w:proofErr w:type="gramEnd"/>
-            <w:r>
-              <w:t xml:space="preserve"> she always needs to view the description of products to make sure she avoids any allergens.</w:t>
+              <w:t>Merinda has some allergies, she always needs to view the description of products to make sure she avoids any allergens.</w:t>
             </w:r>
             <w:r>
               <w:t xml:space="preserve"> Therefore, to make an informed purchase, she needs the feature of viewing product listings otherwise her life could be in danger if she purchases harmful products. The solution must comply with the food information regulations, to prevent this from happening.</w:t>
@@ -4223,6 +4156,7 @@
           </w:tcPr>
           <w:p>
             <w:r>
+              <w:lastRenderedPageBreak/>
               <w:t>Producer information and local benefits</w:t>
             </w:r>
           </w:p>
@@ -5003,10 +4937,7 @@
               </w:numPr>
             </w:pPr>
             <w:r>
-              <w:t xml:space="preserve">Choose </w:t>
-            </w:r>
-            <w:r>
-              <w:t>dark mode</w:t>
+              <w:t>Choose dark mode</w:t>
             </w:r>
           </w:p>
         </w:tc>
@@ -5167,18 +5098,16 @@
           </w:tcPr>
           <w:p>
             <w:r>
-              <w:t xml:space="preserve">The solution must have consistent low latency speed, </w:t>
-            </w:r>
-            <w:proofErr w:type="gramStart"/>
-            <w:r>
-              <w:t>in order for</w:t>
-            </w:r>
-            <w:proofErr w:type="gramEnd"/>
-            <w:r>
-              <w:t xml:space="preserve"> the users to have a seamless experience without any frustration. </w:t>
-            </w:r>
-            <w:r>
-              <w:t>The digital solution should maintain fast service especially for simple activities.</w:t>
+              <w:t xml:space="preserve">The solution must have consistent low latency speed, in order for the users to have a seamless experience without any frustration. </w:t>
+            </w:r>
+            <w:r>
+              <w:t>The digital solution should maintain fast service especially for simple activities</w:t>
+            </w:r>
+            <w:r>
+              <w:t>.</w:t>
+            </w:r>
+            <w:r>
+              <w:t xml:space="preserve"> If not, then the user might choose another service instead.</w:t>
             </w:r>
           </w:p>
         </w:tc>
@@ -5251,7 +5180,11 @@
           <w:tcPr>
             <w:tcW w:w="3005" w:type="dxa"/>
           </w:tcPr>
-          <w:p/>
+          <w:p>
+            <w:r>
+              <w:t>Fast load time is a common convention that the solution must have in order to compete in the market. Users do not appreciate platform with slow load time, making them find other platforms to purchase from.</w:t>
+            </w:r>
+          </w:p>
         </w:tc>
         <w:tc>
           <w:tcPr>
@@ -5298,7 +5231,17 @@
           <w:tcPr>
             <w:tcW w:w="3005" w:type="dxa"/>
           </w:tcPr>
-          <w:p/>
+          <w:p>
+            <w:r>
+              <w:t xml:space="preserve">Users expect the digital solution to be quick to process orders so that customers can make their purchases without delay. Slow </w:t>
+            </w:r>
+            <w:r>
+              <w:t>processing</w:t>
+            </w:r>
+            <w:r>
+              <w:t xml:space="preserve"> time could make the customer anxious when making purchases and even cause them to abandon orders and lose trust in the business.</w:t>
+            </w:r>
+          </w:p>
         </w:tc>
         <w:tc>
           <w:tcPr>
@@ -5337,10 +5280,7 @@
               </w:numPr>
             </w:pPr>
             <w:r>
-              <w:t>99% of orders should be processed successfully without errors</w:t>
-            </w:r>
-            <w:r>
-              <w:t>.</w:t>
+              <w:t>99% of orders should be processed successfully without errors.</w:t>
             </w:r>
           </w:p>
           <w:p>
@@ -5375,7 +5315,14 @@
           <w:tcPr>
             <w:tcW w:w="3005" w:type="dxa"/>
           </w:tcPr>
-          <w:p/>
+          <w:p>
+            <w:r>
+              <w:t xml:space="preserve">The site must provide fast and correct product filtering so customers can easily find what they want. </w:t>
+            </w:r>
+            <w:r>
+              <w:t>If the filters are slow and give the wrong results, the user experience will be poor and low reviews will be given.</w:t>
+            </w:r>
+          </w:p>
         </w:tc>
         <w:tc>
           <w:tcPr>
@@ -5532,6 +5479,7 @@
           </w:tcPr>
           <w:p>
             <w:r>
+              <w:lastRenderedPageBreak/>
               <w:t>Authorisation</w:t>
             </w:r>
           </w:p>
@@ -5542,11 +5490,19 @@
           </w:tcPr>
           <w:p>
             <w:r>
-              <w:t xml:space="preserve">Authorisation must be implemented to make sure only the right users can access </w:t>
-            </w:r>
-            <w:r>
-              <w:lastRenderedPageBreak/>
-              <w:t>some areas of the solution. As an example, only the producers and staff should be able to handle their products and stock, and customers should only be allowed to handle their accounts and orders.</w:t>
+              <w:t>Authorisation must be implemented to make sure only the right users can access some areas of the solution.</w:t>
+            </w:r>
+            <w:r>
+              <w:t xml:space="preserve"> O</w:t>
+            </w:r>
+            <w:r>
+              <w:t xml:space="preserve">nly the producers and staff should be able to </w:t>
+            </w:r>
+            <w:r>
+              <w:t>manage</w:t>
+            </w:r>
+            <w:r>
+              <w:t xml:space="preserve"> their products and stock, and customers should only be allowed to handle their accounts and orders.</w:t>
             </w:r>
           </w:p>
         </w:tc>
@@ -5563,7 +5519,6 @@
               </w:numPr>
             </w:pPr>
             <w:r>
-              <w:lastRenderedPageBreak/>
               <w:t>100% of users must be logged in before being able to access restricted pages.</w:t>
             </w:r>
           </w:p>
@@ -5576,7 +5531,6 @@
               </w:numPr>
             </w:pPr>
             <w:r>
-              <w:lastRenderedPageBreak/>
               <w:t>Role-based access should be applied to all admin/producer features.</w:t>
             </w:r>
           </w:p>
@@ -5617,7 +5571,6 @@
           </w:tcPr>
           <w:p>
             <w:r>
-              <w:lastRenderedPageBreak/>
               <w:t>Unauthorised access prevention</w:t>
             </w:r>
           </w:p>
@@ -5689,15 +5642,7 @@
           </w:tcPr>
           <w:p>
             <w:r>
-              <w:t xml:space="preserve">The site will store personal information such as customer names, email addresses, and delivery details therefore data protection is important. This information must be stored securely so it </w:t>
-            </w:r>
-            <w:proofErr w:type="spellStart"/>
-            <w:r>
-              <w:t>can not</w:t>
-            </w:r>
-            <w:proofErr w:type="spellEnd"/>
-            <w:r>
-              <w:t xml:space="preserve"> be stolen or misused. Protecting this data helps keep users safe and makes sure the solution follow data protection laws. </w:t>
+              <w:t xml:space="preserve">The site will store personal information such as customer names, email addresses, and delivery details therefore data protection is important. This information must be stored securely so it can not be stolen or misused. Protecting this data helps keep users safe and makes sure the solution follow data protection laws. </w:t>
             </w:r>
           </w:p>
         </w:tc>
@@ -5778,11 +5723,9 @@
             <w:r>
               <w:t xml:space="preserve">Two-factor authentication adds an extra layer of security when users log in. Even if someone knows a user’s password, they should still need a second code to access the account. This helps protect accounts from being hacked and keep user data </w:t>
             </w:r>
-            <w:proofErr w:type="gramStart"/>
-            <w:r>
-              <w:t>more safe</w:t>
-            </w:r>
-            <w:proofErr w:type="gramEnd"/>
+            <w:r>
+              <w:t>safer</w:t>
+            </w:r>
             <w:r>
               <w:t>.</w:t>
             </w:r>
@@ -5936,7 +5879,24 @@
           <w:tcPr>
             <w:tcW w:w="3005" w:type="dxa"/>
           </w:tcPr>
-          <w:p/>
+          <w:p>
+            <w:r>
+              <w:t xml:space="preserve">The platform must be able to handle a high number of orders in efficient speed during busy periods. Users should not experience any </w:t>
+            </w:r>
+            <w:r>
+              <w:lastRenderedPageBreak/>
+              <w:t xml:space="preserve">delays when ordering. Having a high order </w:t>
+            </w:r>
+            <w:r>
+              <w:t xml:space="preserve">processing </w:t>
+            </w:r>
+            <w:r>
+              <w:t xml:space="preserve">capacity </w:t>
+            </w:r>
+            <w:r>
+              <w:t>makes sure the system functions smoothly, it makes customers satisfied and eventually supports business growth.</w:t>
+            </w:r>
+          </w:p>
         </w:tc>
         <w:tc>
           <w:tcPr>
@@ -5951,6 +5911,7 @@
               </w:numPr>
             </w:pPr>
             <w:r>
+              <w:lastRenderedPageBreak/>
               <w:t>The system should be able to process over 100 orders per minute.</w:t>
             </w:r>
           </w:p>
@@ -5963,6 +5924,7 @@
               </w:numPr>
             </w:pPr>
             <w:r>
+              <w:lastRenderedPageBreak/>
               <w:t>95% of orders should be processed within 5 seconds.</w:t>
             </w:r>
           </w:p>
@@ -5996,7 +5958,23 @@
           <w:tcPr>
             <w:tcW w:w="3005" w:type="dxa"/>
           </w:tcPr>
-          <w:p/>
+          <w:p>
+            <w:r>
+              <w:t xml:space="preserve">Handling high </w:t>
+            </w:r>
+            <w:r>
+              <w:t>number</w:t>
+            </w:r>
+            <w:r>
+              <w:t xml:space="preserve"> of users at the same time without crashing is important for the solution. If it can not handle many </w:t>
+            </w:r>
+            <w:r>
+              <w:t>users,</w:t>
+            </w:r>
+            <w:r>
+              <w:t xml:space="preserve"> then the website might stop working. This would stop customers from placing any orders, and the trust for the platform reduces. </w:t>
+            </w:r>
+          </w:p>
         </w:tc>
         <w:tc>
           <w:tcPr>
@@ -6058,7 +6036,11 @@
           <w:tcPr>
             <w:tcW w:w="3005" w:type="dxa"/>
           </w:tcPr>
-          <w:p/>
+          <w:p>
+            <w:r>
+              <w:t>The platform will constantly expand when new products are added, new producers and when users register. The system must handle increasing amount of data without slowing down and affecting performance. This is important to support long term use and reliability.</w:t>
+            </w:r>
+          </w:p>
         </w:tc>
         <w:tc>
           <w:tcPr>
@@ -6126,7 +6108,11 @@
           <w:tcPr>
             <w:tcW w:w="3005" w:type="dxa"/>
           </w:tcPr>
-          <w:p/>
+          <w:p>
+            <w:r>
+              <w:t>Multiple producers and admins should be able to manage their products at the same time without any errors. If the solution can not handle this, data might be lost or overwritten causing incorrect product information and failing to comply with the food information regulation.</w:t>
+            </w:r>
+          </w:p>
         </w:tc>
         <w:tc>
           <w:tcPr>
@@ -6300,7 +6286,15 @@
           <w:tcPr>
             <w:tcW w:w="3005" w:type="dxa"/>
           </w:tcPr>
-          <w:p/>
+          <w:p>
+            <w:r>
+              <w:t xml:space="preserve">Platform must successfully maintain performance when multiple users are accessing it at the same time. If the system fails because of the capacity, the users will feel frustrated since they can’t access their accounts and make purchases. </w:t>
+            </w:r>
+            <w:r>
+              <w:lastRenderedPageBreak/>
+              <w:t>The business will lose customers if it can’t remain stable.</w:t>
+            </w:r>
+          </w:p>
         </w:tc>
         <w:tc>
           <w:tcPr>
@@ -6315,6 +6309,7 @@
               </w:numPr>
             </w:pPr>
             <w:r>
+              <w:lastRenderedPageBreak/>
               <w:t>There should be no crashes when multiple users access the system.</w:t>
             </w:r>
           </w:p>
@@ -6347,7 +6342,11 @@
           <w:tcPr>
             <w:tcW w:w="3005" w:type="dxa"/>
           </w:tcPr>
-          <w:p/>
+          <w:p>
+            <w:r>
+              <w:t>The system must be able to handle multiple actions happening simultaneously. Like producers updating stock levels while a user is making a purchase at the same time.</w:t>
+            </w:r>
+          </w:p>
         </w:tc>
         <w:tc>
           <w:tcPr>
@@ -6394,7 +6393,11 @@
           <w:tcPr>
             <w:tcW w:w="3005" w:type="dxa"/>
           </w:tcPr>
-          <w:p/>
+          <w:p>
+            <w:r>
+              <w:t xml:space="preserve">When users click buttons or submitting forms, the platform must respond quickly for an industry standard system. Users could otherwise think the platform is not working making them find other services leading to loss of customers. </w:t>
+            </w:r>
+          </w:p>
         </w:tc>
         <w:tc>
           <w:tcPr>
@@ -6433,7 +6436,6 @@
               </w:numPr>
             </w:pPr>
             <w:r>
-              <w:lastRenderedPageBreak/>
               <w:t>The mobile and desktop response times remain consistent.</w:t>
             </w:r>
           </w:p>
@@ -6446,7 +6448,6 @@
           </w:tcPr>
           <w:p>
             <w:r>
-              <w:lastRenderedPageBreak/>
               <w:t>Data capacity</w:t>
             </w:r>
           </w:p>
@@ -6839,6 +6840,7 @@
                 <w:sz w:val="32"/>
                 <w:szCs w:val="32"/>
               </w:rPr>
+              <w:lastRenderedPageBreak/>
               <w:t>Usability</w:t>
             </w:r>
           </w:p>
@@ -7042,7 +7044,6 @@
               </w:numPr>
             </w:pPr>
             <w:r>
-              <w:lastRenderedPageBreak/>
               <w:t>Users can make a purchase under 5 steps.</w:t>
             </w:r>
           </w:p>
@@ -7067,7 +7068,6 @@
           </w:tcPr>
           <w:p>
             <w:r>
-              <w:lastRenderedPageBreak/>
               <w:t>Intuitive navigation</w:t>
             </w:r>
           </w:p>
@@ -7439,7 +7439,6 @@
         <w:rPr>
           <w:noProof/>
         </w:rPr>
-        <w:lastRenderedPageBreak/>
         <w:drawing>
           <wp:inline distT="0" distB="0" distL="0" distR="0" wp14:anchorId="430B06B4" wp14:editId="2E61D43A">
             <wp:extent cx="4440728" cy="2765146"/>
@@ -7710,7 +7709,14 @@
         <w:rPr>
           <w:rFonts w:ascii="Calibri" w:hAnsi="Calibri" w:cs="Calibri"/>
         </w:rPr>
-        <w:t xml:space="preserve">The simple brown colour will be a great addition that represents the local farmers and food producers as well. The brown will be used for badges and certain call outs across the page. </w:t>
+        <w:t xml:space="preserve">The simple brown colour will be a great addition that represents </w:t>
+      </w:r>
+      <w:r>
+        <w:rPr>
+          <w:rFonts w:ascii="Calibri" w:hAnsi="Calibri" w:cs="Calibri"/>
+        </w:rPr>
+        <w:lastRenderedPageBreak/>
+        <w:t xml:space="preserve">the local farmers and food producers as well. The brown will be used for badges and certain call outs across the page. </w:t>
       </w:r>
     </w:p>
     <w:p>
@@ -7864,7 +7870,6 @@
       </w:pPr>
       <w:bookmarkStart w:id="8" w:name="_Toc224242726"/>
       <w:r>
-        <w:lastRenderedPageBreak/>
         <w:t>Risk Matrix</w:t>
       </w:r>
       <w:bookmarkEnd w:id="8"/>
@@ -8919,15 +8924,7 @@
           </w:tcPr>
           <w:p>
             <w:r>
-              <w:t xml:space="preserve">This will reduce the impact of the risk because wrong listings could be corrected quickly. It stops customers from ordering products that are </w:t>
-            </w:r>
-            <w:proofErr w:type="gramStart"/>
-            <w:r>
-              <w:t>actually out</w:t>
-            </w:r>
-            <w:proofErr w:type="gramEnd"/>
-            <w:r>
-              <w:t xml:space="preserve"> of stock, and this will help maintain customer satisfaction and compliance with the consumer protection from unfair trading regulations.</w:t>
+              <w:t>This will reduce the impact of the risk because wrong listings could be corrected quickly. It stops customers from ordering products that are actually out of stock, and this will help maintain customer satisfaction and compliance with the consumer protection from unfair trading regulations.</w:t>
             </w:r>
           </w:p>
         </w:tc>
@@ -8974,7 +8971,6 @@
           </w:tcPr>
           <w:p>
             <w:r>
-              <w:lastRenderedPageBreak/>
               <w:t>R3</w:t>
             </w:r>
           </w:p>
@@ -9158,7 +9154,6 @@
                 <w:sz w:val="28"/>
                 <w:szCs w:val="28"/>
               </w:rPr>
-              <w:lastRenderedPageBreak/>
               <w:t>Legislation</w:t>
             </w:r>
           </w:p>
@@ -9383,32 +9378,17 @@
             <w:r>
               <w:t xml:space="preserve"> </w:t>
             </w:r>
-            <w:proofErr w:type="gramStart"/>
             <w:r>
               <w:t>are</w:t>
             </w:r>
-            <w:proofErr w:type="gramEnd"/>
-            <w:r>
-              <w:t xml:space="preserve"> responsible for when businesses </w:t>
-            </w:r>
-            <w:proofErr w:type="gramStart"/>
-            <w:r>
-              <w:t>want</w:t>
+            <w:r>
+              <w:t xml:space="preserve"> responsible for when businesses want</w:t>
             </w:r>
             <w:r>
               <w:t>s</w:t>
             </w:r>
-            <w:proofErr w:type="gramEnd"/>
-            <w:r>
-              <w:t xml:space="preserve"> to promote or sell their products, it makes sure that they will not use deceptive or misleading methods to get their products sold. Therefore, the solution must ensure that all product descriptions, prices, availability information, and special offers, must be accurate and true. </w:t>
-            </w:r>
-            <w:proofErr w:type="gramStart"/>
-            <w:r>
-              <w:t>In order to</w:t>
-            </w:r>
-            <w:proofErr w:type="gramEnd"/>
-            <w:r>
-              <w:t xml:space="preserve"> protect customers and maintain Greenfield Local Hubs credibility, the marketing and product information must be honest and transparent.</w:t>
+            <w:r>
+              <w:t xml:space="preserve"> to promote or sell their products, it makes sure that they will not use deceptive or misleading methods to get their products sold. Therefore, the solution must ensure that all product descriptions, prices, availability information, and special offers, must be accurate and true. In order to protect customers and maintain Greenfield Local Hubs credibility, the marketing and product information must be honest and transparent.</w:t>
             </w:r>
           </w:p>
         </w:tc>
@@ -9444,7 +9424,11 @@
               <w:t>Since this platform will be a digital solution that sell products or services online</w:t>
             </w:r>
             <w:r>
-              <w:t xml:space="preserve">, it must comply with the Electronic Commerce (EC Directive) Regulations. Important business information must be displayed such as company contact details, terms and conditions, pricing, ordering processes. A confirmation message must be sent to the customer when an order has been placed. To ensure transparency in online transactions </w:t>
+              <w:t xml:space="preserve">, it must comply with the </w:t>
+            </w:r>
+            <w:r>
+              <w:lastRenderedPageBreak/>
+              <w:t xml:space="preserve">Electronic Commerce (EC Directive) Regulations. Important business information must be displayed such as company contact details, terms and conditions, pricing, ordering processes. A confirmation message must be sent to the customer when an order has been placed. To ensure transparency in online transactions </w:t>
             </w:r>
             <w:r>
               <w:t xml:space="preserve">Greenfield Local Hub must comply with these regulations successfully. </w:t>
@@ -9470,6 +9454,7 @@
                 <w:b/>
                 <w:bCs/>
               </w:rPr>
+              <w:lastRenderedPageBreak/>
               <w:t>Equality Act 2010 &amp; Accessibility Standards WCAG</w:t>
             </w:r>
           </w:p>
@@ -9486,22 +9471,10 @@
               <w:t>es</w:t>
             </w:r>
             <w:r>
-              <w:t xml:space="preserve"> to make sure that people with disabilities can access services successfully. </w:t>
-            </w:r>
-            <w:proofErr w:type="gramStart"/>
-            <w:r>
-              <w:t>In order for</w:t>
-            </w:r>
-            <w:proofErr w:type="gramEnd"/>
-            <w:r>
-              <w:t xml:space="preserve"> business to meet this they must follow the accessibility guidelines such as Web Content Accessibility Guidelines (WCAG). </w:t>
-            </w:r>
-            <w:r>
-              <w:t xml:space="preserve">Features that help make sure that all users can access and use the solution effectively are readable text, clear </w:t>
-            </w:r>
-            <w:r>
-              <w:lastRenderedPageBreak/>
-              <w:t>navigation and compatibility with screen readers. Including accessibility features will support inclusivity and makes sure that the business does not unintentionally exclude certain users.</w:t>
+              <w:t xml:space="preserve"> to make sure that people with disabilities can access services successfully. In order for business to meet this they must follow the accessibility guidelines such as Web Content Accessibility Guidelines (WCAG). </w:t>
+            </w:r>
+            <w:r>
+              <w:t>Features that help make sure that all users can access and use the solution effectively are readable text, clear navigation and compatibility with screen readers. Including accessibility features will support inclusivity and makes sure that the business does not unintentionally exclude certain users.</w:t>
             </w:r>
             <w:r>
               <w:t xml:space="preserve"> The solution will include high contrast mode, dark mode, text size increase/decrease to ensure readability. The solution will also be compatible with screen readers and included as an accessibility feature. </w:t>
@@ -9527,7 +9500,6 @@
                 <w:b/>
                 <w:bCs/>
               </w:rPr>
-              <w:lastRenderedPageBreak/>
               <w:t>General Food Law</w:t>
             </w:r>
             <w:r>
@@ -9578,18 +9550,10 @@
           </w:tcPr>
           <w:p>
             <w:r>
-              <w:t xml:space="preserve">Greenfield Local Hub will comply with the Food Information </w:t>
-            </w:r>
-            <w:proofErr w:type="gramStart"/>
-            <w:r>
-              <w:t>Regulations</w:t>
-            </w:r>
-            <w:r>
-              <w:t>,</w:t>
-            </w:r>
-            <w:proofErr w:type="gramEnd"/>
-            <w:r>
-              <w:t xml:space="preserve"> t</w:t>
+              <w:t>Greenfield Local Hub will comply with the Food Information Regulations</w:t>
+            </w:r>
+            <w:r>
+              <w:t>, t</w:t>
             </w:r>
             <w:r>
               <w:t>his means the solution will</w:t>
@@ -14349,6 +14313,7 @@
   <w:style w:type="character" w:default="1" w:styleId="DefaultParagraphFont">
     <w:name w:val="Default Paragraph Font"/>
     <w:uiPriority w:val="1"/>
+    <w:semiHidden/>
     <w:unhideWhenUsed/>
   </w:style>
   <w:style w:type="table" w:default="1" w:styleId="TableNormal">
@@ -14782,8 +14747,10 @@
     <w:rsid w:val="009F7D5F"/>
     <w:rsid w:val="00B03F3A"/>
     <w:rsid w:val="00B246F6"/>
+    <w:rsid w:val="00B57686"/>
     <w:rsid w:val="00BB7947"/>
     <w:rsid w:val="00C96A43"/>
+    <w:rsid w:val="00E11243"/>
     <w:rsid w:val="00E72ADF"/>
     <w:rsid w:val="00EC41CE"/>
     <w:rsid w:val="00ED6983"/>

</xml_diff>

<commit_message>
Day 6 Exam Break
11:00
</commit_message>
<xml_diff>
--- a/Task 1/Task 1a/Task1_Proposal_LL-000020914_Naser_A.docx
+++ b/Task 1/Task 1a/Task1_Proposal_LL-000020914_Naser_A.docx
@@ -1067,64 +1067,12 @@
       <w:pPr>
         <w:pStyle w:val="Heading1"/>
       </w:pPr>
-      <w:bookmarkStart w:id="0" w:name="_Toc224242718"/>
-      <w:r>
-        <w:lastRenderedPageBreak/>
-        <w:t>Research</w:t>
-      </w:r>
-      <w:bookmarkEnd w:id="0"/>
-    </w:p>
-    <w:p/>
-    <w:p>
-      <w:r>
-        <w:t>robertsfarmshop.co.uk</w:t>
-      </w:r>
-    </w:p>
-    <w:p>
-      <w:r>
-        <w:t>www.beckettsfarm.co.uk</w:t>
-      </w:r>
-    </w:p>
-    <w:p>
-      <w:r>
-        <w:t>moseleyfarmersmarket.org.uk</w:t>
-      </w:r>
-    </w:p>
-    <w:p/>
-    <w:p/>
-    <w:p/>
-    <w:p/>
-    <w:p/>
-    <w:p/>
-    <w:p/>
-    <w:p/>
-    <w:p/>
-    <w:p/>
-    <w:p/>
-    <w:p/>
-    <w:p/>
-    <w:p/>
-    <w:p/>
-    <w:p/>
-    <w:p/>
-    <w:p/>
-    <w:p/>
-    <w:p/>
-    <w:p/>
-    <w:p/>
-    <w:p/>
-    <w:p/>
-    <w:p/>
-    <w:p>
-      <w:pPr>
-        <w:pStyle w:val="Heading1"/>
-      </w:pPr>
-      <w:bookmarkStart w:id="1" w:name="_Toc224242719"/>
+      <w:bookmarkStart w:id="0" w:name="_Toc224242719"/>
       <w:r>
         <w:lastRenderedPageBreak/>
         <w:t>Business Context</w:t>
       </w:r>
-      <w:bookmarkEnd w:id="1"/>
+      <w:bookmarkEnd w:id="0"/>
     </w:p>
     <w:p/>
     <w:p>
@@ -1303,7 +1251,15 @@
         <w:t>For</w:t>
       </w:r>
       <w:r>
-        <w:t xml:space="preserve"> an industry standard solution it must comply with all the consumer legislations, the solution must be clear to all consumers. Customers rely heavily on this information when purchasing online, and without detailed listings that are accurate, they might become uncertain of </w:t>
+        <w:t xml:space="preserve"> an industry standard </w:t>
+      </w:r>
+      <w:proofErr w:type="gramStart"/>
+      <w:r>
+        <w:t>solution</w:t>
+      </w:r>
+      <w:proofErr w:type="gramEnd"/>
+      <w:r>
+        <w:t xml:space="preserve"> it must comply with all the consumer legislations, the solution must be clear to all consumers. Customers rely heavily on this information when purchasing online, and without detailed listings that are accurate, they might become uncertain of </w:t>
       </w:r>
       <w:r>
         <w:t>purchasing or</w:t>
@@ -1558,7 +1514,15 @@
         <w:t xml:space="preserve">The market research the client conducted suggested that the solution should include a loyalty scheme that provides discounts and special offers. With the goal of motivating regular customers to keep purchasing and using the service, this feature will be beneficial for the business. </w:t>
       </w:r>
       <w:r>
-        <w:t>The loyalty scheme and promotional offers will encourage customers to make frequent purchases and discover different products. By introducing this feature it will help increasing customer retention, support consistent revenue for the business and strengthen customer loyalty.</w:t>
+        <w:t xml:space="preserve">The loyalty scheme and promotional offers will encourage customers to make frequent purchases and discover different products. By introducing this </w:t>
+      </w:r>
+      <w:proofErr w:type="gramStart"/>
+      <w:r>
+        <w:t>feature</w:t>
+      </w:r>
+      <w:proofErr w:type="gramEnd"/>
+      <w:r>
+        <w:t xml:space="preserve"> it will help increasing customer retention, support consistent revenue for the business and strengthen customer loyalty.</w:t>
       </w:r>
     </w:p>
     <w:p>
@@ -1674,11 +1638,11 @@
       <w:pPr>
         <w:pStyle w:val="Heading1"/>
       </w:pPr>
-      <w:bookmarkStart w:id="2" w:name="_Toc224242720"/>
+      <w:bookmarkStart w:id="1" w:name="_Toc224242720"/>
       <w:r>
         <w:t>Project Aim</w:t>
       </w:r>
-      <w:bookmarkEnd w:id="2"/>
+      <w:bookmarkEnd w:id="1"/>
     </w:p>
     <w:p/>
     <w:p>
@@ -1911,7 +1875,7 @@
       <w:pPr>
         <w:pStyle w:val="Heading1"/>
       </w:pPr>
-      <w:bookmarkStart w:id="3" w:name="_Toc224242721"/>
+      <w:bookmarkStart w:id="2" w:name="_Toc224242721"/>
     </w:p>
     <w:p/>
     <w:p>
@@ -1922,10 +1886,12 @@
         <w:lastRenderedPageBreak/>
         <w:t>Functional Requirements</w:t>
       </w:r>
-      <w:bookmarkEnd w:id="3"/>
+      <w:bookmarkEnd w:id="2"/>
     </w:p>
-    <w:p/>
     <w:p>
+      <w:pPr>
+        <w:spacing w:before="240"/>
+      </w:pPr>
       <w:r>
         <w:t>Personas</w:t>
       </w:r>
@@ -2058,7 +2024,7 @@
         <w:t xml:space="preserve">special </w:t>
       </w:r>
       <w:r>
-        <w:t xml:space="preserve">offers. </w:t>
+        <w:t>offers.</w:t>
       </w:r>
     </w:p>
     <w:p/>
@@ -3036,7 +3002,15 @@
           </w:tcPr>
           <w:p>
             <w:r>
-              <w:t>In order for Jack to view his saved up loyalty points, view his previous orders, place orders and track them he will need to log in to his existing account. The saved data from previous sessions are only accessible when logged in.</w:t>
+              <w:t xml:space="preserve">In order for Jack to view his </w:t>
+            </w:r>
+            <w:proofErr w:type="gramStart"/>
+            <w:r>
+              <w:t>saved up</w:t>
+            </w:r>
+            <w:proofErr w:type="gramEnd"/>
+            <w:r>
+              <w:t xml:space="preserve"> loyalty points, view his previous orders, place orders and track them he will need to log in to his existing account. The saved data from previous sessions are only accessible when logged in.</w:t>
             </w:r>
           </w:p>
         </w:tc>
@@ -3446,7 +3420,15 @@
               <w:t xml:space="preserve">Merinda has made a new email address and wants to replace her current accounts email to the new one. </w:t>
             </w:r>
             <w:r>
-              <w:t>She wants to view the account information so she can update it to the new email. Viewing account information is useful since she can update the details all by herself, instead of having to call support and stay online for a simple email update. That is why this feature is efficient and saves both customer and the staffs time.</w:t>
+              <w:t xml:space="preserve">She wants to view the account information so she can update it to the new email. Viewing account information is useful since she can update the details all by herself, instead of having to call support and stay online for a simple email update. That is why this feature is efficient and saves both customer and the </w:t>
+            </w:r>
+            <w:proofErr w:type="gramStart"/>
+            <w:r>
+              <w:t>staffs</w:t>
+            </w:r>
+            <w:proofErr w:type="gramEnd"/>
+            <w:r>
+              <w:t xml:space="preserve"> time.</w:t>
             </w:r>
           </w:p>
         </w:tc>
@@ -3789,7 +3771,15 @@
           </w:tcPr>
           <w:p>
             <w:r>
-              <w:t>Merinda has some allergies, she always needs to view the description of products to make sure she avoids any allergens.</w:t>
+              <w:t xml:space="preserve">Merinda has some </w:t>
+            </w:r>
+            <w:proofErr w:type="gramStart"/>
+            <w:r>
+              <w:t>allergies,</w:t>
+            </w:r>
+            <w:proofErr w:type="gramEnd"/>
+            <w:r>
+              <w:t xml:space="preserve"> she always needs to view the description of products to make sure she avoids any allergens.</w:t>
             </w:r>
             <w:r>
               <w:t xml:space="preserve"> Therefore, to make an informed purchase, she needs the feature of viewing product listings otherwise her life could be in danger if she purchases harmful products. The solution must comply with the food information regulations, to prevent this from happening.</w:t>
@@ -4974,15 +4964,15 @@
     <w:p>
       <w:pPr>
         <w:pStyle w:val="Heading1"/>
-      </w:pPr>
-      <w:bookmarkStart w:id="4" w:name="_Toc224242722"/>
+        <w:spacing w:after="240"/>
+      </w:pPr>
+      <w:bookmarkStart w:id="3" w:name="_Toc224242722"/>
       <w:r>
         <w:lastRenderedPageBreak/>
         <w:t>Non-Functional Requirements</w:t>
       </w:r>
-      <w:bookmarkEnd w:id="4"/>
+      <w:bookmarkEnd w:id="3"/>
     </w:p>
-    <w:p/>
     <w:tbl>
       <w:tblPr>
         <w:tblStyle w:val="TableGrid"/>
@@ -6643,7 +6633,11 @@
           <w:tcPr>
             <w:tcW w:w="3005" w:type="dxa"/>
           </w:tcPr>
-          <w:p/>
+          <w:p>
+            <w:r>
+              <w:t xml:space="preserve">Error handling must be properly handled by the digital solution, it is important to show clear messages to users when an error happens. Without any proper error handling, users will be confused why the platform is not working which will lead to contacting the support team. This will only add more work to staff and frustration for users. </w:t>
+            </w:r>
+          </w:p>
         </w:tc>
         <w:tc>
           <w:tcPr>
@@ -6696,7 +6690,10 @@
           </w:tcPr>
           <w:p>
             <w:r>
-              <w:t>_context could be referenced</w:t>
+              <w:t xml:space="preserve">The solution must be able to recover quickly from a system failure without loosing any data. </w:t>
+            </w:r>
+            <w:r>
+              <w:t xml:space="preserve">If data can’t be recovered after a system failure, users orders, or account information could be lost. Users will not trust the platform. </w:t>
             </w:r>
           </w:p>
         </w:tc>
@@ -6741,6 +6738,7 @@
           </w:tcPr>
           <w:p>
             <w:r>
+              <w:lastRenderedPageBreak/>
               <w:t>Backups</w:t>
             </w:r>
           </w:p>
@@ -6754,7 +6752,16 @@
               <w:t>Automatic backups must be consistently done so</w:t>
             </w:r>
             <w:r>
-              <w:t xml:space="preserve"> that if any crashes or system failure happens, all the data is secure and safe. This helps </w:t>
+              <w:t xml:space="preserve"> that if any crashes or system failure happens, all the data is secure and safe</w:t>
+            </w:r>
+            <w:r>
+              <w:t xml:space="preserve"> and could be recovered quick</w:t>
+            </w:r>
+            <w:r>
+              <w:t xml:space="preserve">. This helps </w:t>
+            </w:r>
+            <w:r>
+              <w:t>reduce the risk of permanent data loss and makes sure that the business could continue run smoothly while keeping customer trust.</w:t>
             </w:r>
           </w:p>
         </w:tc>
@@ -6810,7 +6817,17 @@
           <w:tcPr>
             <w:tcW w:w="3005" w:type="dxa"/>
           </w:tcPr>
-          <w:p/>
+          <w:p>
+            <w:r>
+              <w:t xml:space="preserve">Customer orders must be stored correctly within the system, without any errors or duplications. If incorrect orders are created, it will cause extra work for </w:t>
+            </w:r>
+            <w:r>
+              <w:t xml:space="preserve">the producers. </w:t>
+            </w:r>
+            <w:r>
+              <w:t xml:space="preserve"> </w:t>
+            </w:r>
+          </w:p>
         </w:tc>
         <w:tc>
           <w:tcPr>
@@ -6881,7 +6898,6 @@
                 <w:sz w:val="32"/>
                 <w:szCs w:val="32"/>
               </w:rPr>
-              <w:lastRenderedPageBreak/>
               <w:t>Usability</w:t>
             </w:r>
           </w:p>
@@ -6955,7 +6971,11 @@
           <w:tcPr>
             <w:tcW w:w="2944" w:type="dxa"/>
           </w:tcPr>
-          <w:p/>
+          <w:p>
+            <w:r>
+              <w:t>The platform should be able to work on different screen sizes such as desktops, mobile phones and tablets. Key elements must successfully adjust to the screen size of the device to make sure the user have the best experience.</w:t>
+            </w:r>
+          </w:p>
         </w:tc>
         <w:tc>
           <w:tcPr>
@@ -7005,7 +7025,14 @@
           <w:tcPr>
             <w:tcW w:w="2944" w:type="dxa"/>
           </w:tcPr>
-          <w:p/>
+          <w:p>
+            <w:r>
+              <w:t xml:space="preserve">The design of the digital solution must have a consistent layout across all pages, like fonts, colours and structure of the design. If the design is changes between pages, it may confuse some of the users and it could lead to a worse user experience. </w:t>
+            </w:r>
+            <w:r>
+              <w:t xml:space="preserve">A consistent layout will make sure the website is usable. </w:t>
+            </w:r>
+          </w:p>
         </w:tc>
         <w:tc>
           <w:tcPr>
@@ -7058,7 +7085,15 @@
           <w:tcPr>
             <w:tcW w:w="2944" w:type="dxa"/>
           </w:tcPr>
-          <w:p/>
+          <w:p>
+            <w:r>
+              <w:t xml:space="preserve">Users must be able to complete tasks quickly and easily in the platform. If users experience too many steps just to perform a simple action, they could be frustrated and looking to find another service. Reducing the amount of clicks and making </w:t>
+            </w:r>
+            <w:r>
+              <w:lastRenderedPageBreak/>
+              <w:t xml:space="preserve">processes fast, will only make sure the user experience is great. </w:t>
+            </w:r>
+          </w:p>
         </w:tc>
         <w:tc>
           <w:tcPr>
@@ -7073,6 +7108,7 @@
               </w:numPr>
             </w:pPr>
             <w:r>
+              <w:lastRenderedPageBreak/>
               <w:t>There should be minimal clicks required to access key features.</w:t>
             </w:r>
           </w:p>
@@ -7117,7 +7153,19 @@
           <w:tcPr>
             <w:tcW w:w="2944" w:type="dxa"/>
           </w:tcPr>
-          <w:p/>
+          <w:p>
+            <w:r>
+              <w:t xml:space="preserve">The navigation of the website must me easy to use to all types of users. They should find what they are looking for easily with minimal number of clicks. Having a simple and </w:t>
+            </w:r>
+            <w:proofErr w:type="gramStart"/>
+            <w:r>
+              <w:t>well structured</w:t>
+            </w:r>
+            <w:proofErr w:type="gramEnd"/>
+            <w:r>
+              <w:t xml:space="preserve"> navigation bar and footer will improve the usability of the system.</w:t>
+            </w:r>
+          </w:p>
         </w:tc>
         <w:tc>
           <w:tcPr>
@@ -7162,8 +7210,8 @@
       </w:tblPr>
       <w:tblGrid>
         <w:gridCol w:w="3005"/>
-        <w:gridCol w:w="3005"/>
-        <w:gridCol w:w="3006"/>
+        <w:gridCol w:w="3227"/>
+        <w:gridCol w:w="2784"/>
       </w:tblGrid>
       <w:tr>
         <w:tc>
@@ -7216,7 +7264,7 @@
         </w:tc>
         <w:tc>
           <w:tcPr>
-            <w:tcW w:w="3005" w:type="dxa"/>
+            <w:tcW w:w="3227" w:type="dxa"/>
           </w:tcPr>
           <w:p>
             <w:pPr>
@@ -7233,7 +7281,7 @@
         </w:tc>
         <w:tc>
           <w:tcPr>
-            <w:tcW w:w="3006" w:type="dxa"/>
+            <w:tcW w:w="2784" w:type="dxa"/>
           </w:tcPr>
           <w:p>
             <w:pPr>
@@ -7262,13 +7310,17 @@
         </w:tc>
         <w:tc>
           <w:tcPr>
-            <w:tcW w:w="3005" w:type="dxa"/>
-          </w:tcPr>
-          <w:p/>
-        </w:tc>
-        <w:tc>
-          <w:tcPr>
-            <w:tcW w:w="3006" w:type="dxa"/>
+            <w:tcW w:w="3227" w:type="dxa"/>
+          </w:tcPr>
+          <w:p>
+            <w:r>
+              <w:t xml:space="preserve">The digital solution should be able to increase text size without breaking its layout. This will be beneficial to users with sight problems, and it will improve accessibility. This will make sure the solution could be accessible to an even larger audience. </w:t>
+            </w:r>
+          </w:p>
+        </w:tc>
+        <w:tc>
+          <w:tcPr>
+            <w:tcW w:w="2784" w:type="dxa"/>
           </w:tcPr>
           <w:p>
             <w:pPr>
@@ -7309,13 +7361,17 @@
         </w:tc>
         <w:tc>
           <w:tcPr>
-            <w:tcW w:w="3005" w:type="dxa"/>
-          </w:tcPr>
-          <w:p/>
-        </w:tc>
-        <w:tc>
-          <w:tcPr>
-            <w:tcW w:w="3006" w:type="dxa"/>
+            <w:tcW w:w="3227" w:type="dxa"/>
+          </w:tcPr>
+          <w:p>
+            <w:r>
+              <w:t>The fonts used in the solution must be easy to read and clear to all users. If fonts are hard to read, user might struggle to use the system and potential sales could be lost. Web safe fonts will improve readability and user experience.</w:t>
+            </w:r>
+          </w:p>
+        </w:tc>
+        <w:tc>
+          <w:tcPr>
+            <w:tcW w:w="2784" w:type="dxa"/>
           </w:tcPr>
           <w:p>
             <w:pPr>
@@ -7365,13 +7421,20 @@
         </w:tc>
         <w:tc>
           <w:tcPr>
-            <w:tcW w:w="3005" w:type="dxa"/>
-          </w:tcPr>
-          <w:p/>
-        </w:tc>
-        <w:tc>
-          <w:tcPr>
-            <w:tcW w:w="3006" w:type="dxa"/>
+            <w:tcW w:w="3227" w:type="dxa"/>
+          </w:tcPr>
+          <w:p>
+            <w:r>
+              <w:t>Users with visual impairments should be able to navigate through the website easily, and that is by al</w:t>
+            </w:r>
+            <w:r>
+              <w:t>lowing the solution to work well with screen readers. Screen readers should be able to access navigation links and key elements to ensure the user can use the system well.</w:t>
+            </w:r>
+          </w:p>
+        </w:tc>
+        <w:tc>
+          <w:tcPr>
+            <w:tcW w:w="2784" w:type="dxa"/>
           </w:tcPr>
           <w:p>
             <w:pPr>
@@ -7418,13 +7481,23 @@
         </w:tc>
         <w:tc>
           <w:tcPr>
-            <w:tcW w:w="3005" w:type="dxa"/>
-          </w:tcPr>
-          <w:p/>
-        </w:tc>
-        <w:tc>
-          <w:tcPr>
-            <w:tcW w:w="3006" w:type="dxa"/>
+            <w:tcW w:w="3227" w:type="dxa"/>
+          </w:tcPr>
+          <w:p>
+            <w:r>
+              <w:t xml:space="preserve">Content must be easy to read, therefore colour contrast between text and background must be clear. Without colour contrast users might not be able to read important information, this is </w:t>
+            </w:r>
+            <w:r>
+              <w:t>especially</w:t>
+            </w:r>
+            <w:r>
+              <w:t xml:space="preserve"> important for users with visual impairments. </w:t>
+            </w:r>
+          </w:p>
+        </w:tc>
+        <w:tc>
+          <w:tcPr>
+            <w:tcW w:w="2784" w:type="dxa"/>
           </w:tcPr>
           <w:p>
             <w:pPr>
@@ -7453,23 +7526,17 @@
         </w:tc>
       </w:tr>
     </w:tbl>
-    <w:p/>
-    <w:p/>
-    <w:p/>
-    <w:p/>
-    <w:p/>
-    <w:p/>
-    <w:p/>
     <w:p>
       <w:pPr>
         <w:pStyle w:val="Heading1"/>
         <w:spacing w:after="240"/>
       </w:pPr>
-      <w:bookmarkStart w:id="5" w:name="_Toc224242723"/>
-      <w:r>
+      <w:bookmarkStart w:id="4" w:name="_Toc224242723"/>
+      <w:r>
+        <w:lastRenderedPageBreak/>
         <w:t>Hierarchy Diagram</w:t>
       </w:r>
-      <w:bookmarkEnd w:id="5"/>
+      <w:bookmarkEnd w:id="4"/>
     </w:p>
     <w:p/>
     <w:p>
@@ -7539,11 +7606,11 @@
       <w:pPr>
         <w:pStyle w:val="Heading1"/>
       </w:pPr>
-      <w:bookmarkStart w:id="6" w:name="_Toc224242724"/>
+      <w:bookmarkStart w:id="5" w:name="_Toc224242724"/>
       <w:r>
         <w:t>UI Considerations</w:t>
       </w:r>
-      <w:bookmarkEnd w:id="6"/>
+      <w:bookmarkEnd w:id="5"/>
     </w:p>
     <w:p>
       <w:pPr>
@@ -7750,14 +7817,7 @@
         <w:rPr>
           <w:rFonts w:ascii="Calibri" w:hAnsi="Calibri" w:cs="Calibri"/>
         </w:rPr>
-        <w:t xml:space="preserve">The simple brown colour will be a great addition that represents </w:t>
-      </w:r>
-      <w:r>
-        <w:rPr>
-          <w:rFonts w:ascii="Calibri" w:hAnsi="Calibri" w:cs="Calibri"/>
-        </w:rPr>
-        <w:lastRenderedPageBreak/>
-        <w:t xml:space="preserve">the local farmers and food producers as well. The brown will be used for badges and certain call outs across the page. </w:t>
+        <w:t xml:space="preserve">The simple brown colour will be a great addition that represents the local farmers and food producers as well. The brown will be used for badges and certain call outs across the page. </w:t>
       </w:r>
     </w:p>
     <w:p>
@@ -7898,22 +7958,23 @@
       <w:pPr>
         <w:pStyle w:val="Heading1"/>
       </w:pPr>
-      <w:bookmarkStart w:id="7" w:name="_Toc224242725"/>
-      <w:r>
+      <w:bookmarkStart w:id="6" w:name="_Toc224242725"/>
+      <w:r>
+        <w:lastRenderedPageBreak/>
         <w:t>Security Considerations &amp; Risk Mitigation</w:t>
       </w:r>
-      <w:bookmarkEnd w:id="7"/>
+      <w:bookmarkEnd w:id="6"/>
     </w:p>
     <w:p/>
     <w:p>
       <w:pPr>
         <w:pStyle w:val="Heading2"/>
       </w:pPr>
-      <w:bookmarkStart w:id="8" w:name="_Toc224242726"/>
+      <w:bookmarkStart w:id="7" w:name="_Toc224242726"/>
       <w:r>
         <w:t>Risk Matrix</w:t>
       </w:r>
-      <w:bookmarkEnd w:id="8"/>
+      <w:bookmarkEnd w:id="7"/>
     </w:p>
     <w:p/>
     <w:tbl>
@@ -8987,7 +9048,11 @@
           </w:tcPr>
           <w:p>
             <w:r>
-              <w:t xml:space="preserve">Proper error handling, logging and request validation could be implemented in the solution. If the digital solution fails, an error page could be shown while the issue is </w:t>
+              <w:t xml:space="preserve">Proper error handling, logging and request validation could be implemented in the solution. If the digital solution fails, an </w:t>
+            </w:r>
+            <w:r>
+              <w:lastRenderedPageBreak/>
+              <w:t xml:space="preserve">error page could be shown while the issue is </w:t>
             </w:r>
             <w:r>
               <w:t>being logged for developers to fix.</w:t>
@@ -9000,7 +9065,12 @@
           </w:tcPr>
           <w:p>
             <w:r>
-              <w:t>Error logging lets developers quickly identify and fix the problem, while the page stops users from seeing technical crash messages. This reduces the impact because users will not lose their order information if an error occurs.</w:t>
+              <w:lastRenderedPageBreak/>
+              <w:t xml:space="preserve">Error logging lets developers quickly identify and fix the problem, while the page stops users from seeing technical crash messages. This reduces </w:t>
+            </w:r>
+            <w:r>
+              <w:lastRenderedPageBreak/>
+              <w:t>the impact because users will not lose their order information if an error occurs.</w:t>
             </w:r>
           </w:p>
         </w:tc>
@@ -9012,6 +9082,7 @@
           </w:tcPr>
           <w:p>
             <w:r>
+              <w:lastRenderedPageBreak/>
               <w:t>R3</w:t>
             </w:r>
           </w:p>
@@ -9157,11 +9228,12 @@
       <w:pPr>
         <w:pStyle w:val="Heading1"/>
       </w:pPr>
-      <w:bookmarkStart w:id="9" w:name="_Toc224242727"/>
-      <w:r>
+      <w:bookmarkStart w:id="8" w:name="_Toc224242727"/>
+      <w:r>
+        <w:lastRenderedPageBreak/>
         <w:t>Legal and Regulatory Guidelines</w:t>
       </w:r>
-      <w:bookmarkEnd w:id="9"/>
+      <w:bookmarkEnd w:id="8"/>
     </w:p>
     <w:p/>
     <w:tbl>
@@ -9423,11 +9495,16 @@
               <w:t>are</w:t>
             </w:r>
             <w:r>
-              <w:t xml:space="preserve"> responsible for when businesses want</w:t>
+              <w:t xml:space="preserve"> responsible for when businesses </w:t>
+            </w:r>
+            <w:proofErr w:type="gramStart"/>
+            <w:r>
+              <w:t>want</w:t>
             </w:r>
             <w:r>
               <w:t>s</w:t>
             </w:r>
+            <w:proofErr w:type="gramEnd"/>
             <w:r>
               <w:t xml:space="preserve"> to promote or sell their products, it makes sure that they will not use deceptive or misleading methods to get their products sold. Therefore, the solution must ensure that all product descriptions, prices, availability information, and special offers, must be accurate and true. In order to protect customers and maintain Greenfield Local Hubs credibility, the marketing and product information must be honest and transparent.</w:t>
             </w:r>
@@ -9465,11 +9542,7 @@
               <w:t>Since this platform will be a digital solution that sell products or services online</w:t>
             </w:r>
             <w:r>
-              <w:t xml:space="preserve">, it must comply with the </w:t>
-            </w:r>
-            <w:r>
-              <w:lastRenderedPageBreak/>
-              <w:t xml:space="preserve">Electronic Commerce (EC Directive) Regulations. Important business information must be displayed such as company contact details, terms and conditions, pricing, ordering processes. A confirmation message must be sent to the customer when an order has been placed. To ensure transparency in online transactions </w:t>
+              <w:t xml:space="preserve">, it must comply with the Electronic Commerce (EC Directive) Regulations. Important business information must be displayed such as company contact details, terms and conditions, pricing, ordering processes. A confirmation message must be sent to the customer when an order has been placed. To ensure transparency in online transactions </w:t>
             </w:r>
             <w:r>
               <w:t xml:space="preserve">Greenfield Local Hub must comply with these regulations successfully. </w:t>
@@ -9495,24 +9568,27 @@
                 <w:b/>
                 <w:bCs/>
               </w:rPr>
+              <w:t>Equality Act 2010 &amp; Accessibility Standards WCAG</w:t>
+            </w:r>
+          </w:p>
+        </w:tc>
+        <w:tc>
+          <w:tcPr>
+            <w:tcW w:w="5052" w:type="dxa"/>
+          </w:tcPr>
+          <w:p>
+            <w:r>
+              <w:t>The Equality Act requires business</w:t>
+            </w:r>
+            <w:r>
+              <w:t>es</w:t>
+            </w:r>
+            <w:r>
+              <w:t xml:space="preserve"> to make sure that people with disabilities can access services successfully. In order for business to meet this they must follow the accessibility guidelines such as Web </w:t>
+            </w:r>
+            <w:r>
               <w:lastRenderedPageBreak/>
-              <w:t>Equality Act 2010 &amp; Accessibility Standards WCAG</w:t>
-            </w:r>
-          </w:p>
-        </w:tc>
-        <w:tc>
-          <w:tcPr>
-            <w:tcW w:w="5052" w:type="dxa"/>
-          </w:tcPr>
-          <w:p>
-            <w:r>
-              <w:t>The Equality Act requires business</w:t>
-            </w:r>
-            <w:r>
-              <w:t>es</w:t>
-            </w:r>
-            <w:r>
-              <w:t xml:space="preserve"> to make sure that people with disabilities can access services successfully. In order for business to meet this they must follow the accessibility guidelines such as Web Content Accessibility Guidelines (WCAG). </w:t>
+              <w:t xml:space="preserve">Content Accessibility Guidelines (WCAG). </w:t>
             </w:r>
             <w:r>
               <w:t>Features that help make sure that all users can access and use the solution effectively are readable text, clear navigation and compatibility with screen readers. Including accessibility features will support inclusivity and makes sure that the business does not unintentionally exclude certain users.</w:t>
@@ -9541,6 +9617,7 @@
                 <w:b/>
                 <w:bCs/>
               </w:rPr>
+              <w:lastRenderedPageBreak/>
               <w:t>General Food Law</w:t>
             </w:r>
             <w:r>
@@ -14775,11 +14852,13 @@
     <w:rsid w:val="009D2B66"/>
     <w:rsid w:val="009F1E87"/>
     <w:rsid w:val="009F7D5F"/>
+    <w:rsid w:val="00A14DAF"/>
     <w:rsid w:val="00B03F3A"/>
     <w:rsid w:val="00B246F6"/>
     <w:rsid w:val="00B57686"/>
     <w:rsid w:val="00BB7947"/>
     <w:rsid w:val="00C96A43"/>
+    <w:rsid w:val="00D2299C"/>
     <w:rsid w:val="00E11243"/>
     <w:rsid w:val="00E72ADF"/>
     <w:rsid w:val="00EC41CE"/>

</xml_diff>